<commit_message>
TODO 0.5: chore(booking): configure port, datasource and movie service url
</commit_message>
<xml_diff>
--- a/Assignment1/Assignment 1_template.docx
+++ b/Assignment1/Assignment 1_template.docx
@@ -1,6 +1,6 @@
 
 <file path=word/document.xml><?xml version="1.0" encoding="utf-8"?>
-<w:document xmlns:wpc="http://schemas.microsoft.com/office/word/2010/wordprocessingCanvas" xmlns:cx="http://schemas.microsoft.com/office/drawing/2014/chartex" xmlns:cx1="http://schemas.microsoft.com/office/drawing/2015/9/8/chartex" xmlns:cx2="http://schemas.microsoft.com/office/drawing/2015/10/21/chartex" xmlns:cx3="http://schemas.microsoft.com/office/drawing/2016/5/9/chartex" xmlns:cx4="http://schemas.microsoft.com/office/drawing/2016/5/10/chartex" xmlns:cx5="http://schemas.microsoft.com/office/drawing/2016/5/11/chartex" xmlns:cx6="http://schemas.microsoft.com/office/drawing/2016/5/12/chartex" xmlns:cx7="http://schemas.microsoft.com/office/drawing/2016/5/13/chartex" xmlns:cx8="http://schemas.microsoft.com/office/drawing/2016/5/14/chartex" xmlns:mc="http://schemas.openxmlformats.org/markup-compatibility/2006" xmlns:aink="http://schemas.microsoft.com/office/drawing/2016/ink" xmlns:am3d="http://schemas.microsoft.com/office/drawing/2017/model3d" xmlns:o="urn:schemas-microsoft-com:office:office" xmlns:oel="http://schemas.microsoft.com/office/2019/extlst" xmlns:r="http://schemas.openxmlformats.org/officeDocument/2006/relationships" xmlns:m="http://schemas.openxmlformats.org/officeDocument/2006/math" xmlns:v="urn:schemas-microsoft-com:vml" xmlns:wp14="http://schemas.microsoft.com/office/word/2010/wordprocessingDrawing" xmlns:wp="http://schemas.openxmlformats.org/drawingml/2006/wordprocessingDrawing" xmlns:w10="urn:schemas-microsoft-com:office:word" xmlns:w="http://schemas.openxmlformats.org/wordprocessingml/2006/main" xmlns:w14="http://schemas.microsoft.com/office/word/2010/wordml" xmlns:w15="http://schemas.microsoft.com/office/word/2012/wordml" xmlns:w16cex="http://schemas.microsoft.com/office/word/2018/wordml/cex" xmlns:w16cid="http://schemas.microsoft.com/office/word/2016/wordml/cid" xmlns:w16="http://schemas.microsoft.com/office/word/2018/wordml" xmlns:w16du="http://schemas.microsoft.com/office/word/2023/wordml/word16du" xmlns:w16sdtdh="http://schemas.microsoft.com/office/word/2020/wordml/sdtdatahash" xmlns:w16sdtfl="http://schemas.microsoft.com/office/word/2024/wordml/sdtformatlock" xmlns:w16se="http://schemas.microsoft.com/office/word/2015/wordml/symex" xmlns:wpg="http://schemas.microsoft.com/office/word/2010/wordprocessingGroup" xmlns:wpi="http://schemas.microsoft.com/office/word/2010/wordprocessingInk" xmlns:wne="http://schemas.microsoft.com/office/word/2006/wordml" xmlns:wps="http://schemas.microsoft.com/office/word/2010/wordprocessingShape" mc:Ignorable="w14 w15 w16se w16cid w16 w16cex w16sdtdh w16sdtfl w16du wp14">
+<w:document xmlns:wpc="http://schemas.microsoft.com/office/word/2010/wordprocessingCanvas" xmlns:mc="http://schemas.openxmlformats.org/markup-compatibility/2006" xmlns:o="urn:schemas-microsoft-com:office:office" xmlns:r="http://schemas.openxmlformats.org/officeDocument/2006/relationships" xmlns:m="http://schemas.openxmlformats.org/officeDocument/2006/math" xmlns:v="urn:schemas-microsoft-com:vml" xmlns:wp14="http://schemas.microsoft.com/office/word/2010/wordprocessingDrawing" xmlns:wp="http://schemas.openxmlformats.org/drawingml/2006/wordprocessingDrawing" xmlns:w10="urn:schemas-microsoft-com:office:word" xmlns:w="http://schemas.openxmlformats.org/wordprocessingml/2006/main" xmlns:w14="http://schemas.microsoft.com/office/word/2010/wordml" xmlns:w15="http://schemas.microsoft.com/office/word/2012/wordml" xmlns:wpg="http://schemas.microsoft.com/office/word/2010/wordprocessingGroup" xmlns:wpi="http://schemas.microsoft.com/office/word/2010/wordprocessingInk" xmlns:wne="http://schemas.microsoft.com/office/word/2006/wordml" xmlns:wps="http://schemas.microsoft.com/office/word/2010/wordprocessingShape" mc:Ignorable="w14 w15 wp14">
   <w:body>
     <w:p>
       <w:pPr>
@@ -72,21 +72,7 @@
         <w:rPr>
           <w:lang w:val="en-US"/>
         </w:rPr>
-        <w:t xml:space="preserve">Link </w:t>
-      </w:r>
-      <w:proofErr w:type="spellStart"/>
-      <w:r>
-        <w:rPr>
-          <w:lang w:val="en-US"/>
-        </w:rPr>
-        <w:t>github</w:t>
-      </w:r>
-      <w:proofErr w:type="spellEnd"/>
-      <w:r>
-        <w:rPr>
-          <w:lang w:val="en-US"/>
-        </w:rPr>
-        <w:t>:</w:t>
+        <w:t>Link github:</w:t>
       </w:r>
     </w:p>
     <w:p>
@@ -110,6 +96,13 @@
     </w:p>
     <w:sdt>
       <w:sdtPr>
+        <w:rPr>
+          <w:rFonts w:ascii="Times New Roman" w:eastAsia="Times New Roman" w:hAnsi="Times New Roman" w:cs="Times New Roman"/>
+          <w:color w:val="auto"/>
+          <w:sz w:val="26"/>
+          <w:szCs w:val="24"/>
+          <w:lang w:val="vi"/>
+        </w:rPr>
         <w:id w:val="1071310652"/>
         <w:docPartObj>
           <w:docPartGallery w:val="Table of Contents"/>
@@ -118,14 +111,9 @@
       </w:sdtPr>
       <w:sdtEndPr>
         <w:rPr>
-          <w:rFonts w:ascii="Times New Roman" w:eastAsia="Times New Roman" w:hAnsi="Times New Roman" w:cs="Times New Roman"/>
           <w:b/>
           <w:bCs/>
           <w:noProof/>
-          <w:color w:val="auto"/>
-          <w:sz w:val="26"/>
-          <w:szCs w:val="24"/>
-          <w:lang w:val="vi"/>
         </w:rPr>
       </w:sdtEndPr>
       <w:sdtContent>
@@ -138,31 +126,13 @@
               <w:color w:val="auto"/>
             </w:rPr>
           </w:pPr>
-          <w:proofErr w:type="spellStart"/>
           <w:r>
             <w:rPr>
               <w:rFonts w:ascii="Times New Roman" w:hAnsi="Times New Roman" w:cs="Times New Roman"/>
               <w:color w:val="auto"/>
             </w:rPr>
-            <w:t>Mục</w:t>
+            <w:t>Mục lục</w:t>
           </w:r>
-          <w:proofErr w:type="spellEnd"/>
-          <w:r>
-            <w:rPr>
-              <w:rFonts w:ascii="Times New Roman" w:hAnsi="Times New Roman" w:cs="Times New Roman"/>
-              <w:color w:val="auto"/>
-            </w:rPr>
-            <w:t xml:space="preserve"> </w:t>
-          </w:r>
-          <w:proofErr w:type="spellStart"/>
-          <w:r>
-            <w:rPr>
-              <w:rFonts w:ascii="Times New Roman" w:hAnsi="Times New Roman" w:cs="Times New Roman"/>
-              <w:color w:val="auto"/>
-            </w:rPr>
-            <w:t>lục</w:t>
-          </w:r>
-          <w:proofErr w:type="spellEnd"/>
         </w:p>
         <w:p>
           <w:pPr>
@@ -961,47 +931,7 @@
       <w:bookmarkStart w:id="0" w:name="_Toc241853211"/>
       <w:r>
         <w:lastRenderedPageBreak/>
-        <w:t xml:space="preserve">F0 – </w:t>
-      </w:r>
-      <w:proofErr w:type="spellStart"/>
-      <w:r>
-        <w:t>Hạ</w:t>
-      </w:r>
-      <w:proofErr w:type="spellEnd"/>
-      <w:r>
-        <w:t xml:space="preserve"> </w:t>
-      </w:r>
-      <w:proofErr w:type="spellStart"/>
-      <w:r>
-        <w:t>tầng</w:t>
-      </w:r>
-      <w:proofErr w:type="spellEnd"/>
-      <w:r>
-        <w:t xml:space="preserve"> </w:t>
-      </w:r>
-      <w:proofErr w:type="spellStart"/>
-      <w:r>
-        <w:t>và</w:t>
-      </w:r>
-      <w:proofErr w:type="spellEnd"/>
-      <w:r>
-        <w:t xml:space="preserve"> </w:t>
-      </w:r>
-      <w:proofErr w:type="spellStart"/>
-      <w:r>
-        <w:t>khởi</w:t>
-      </w:r>
-      <w:proofErr w:type="spellEnd"/>
-      <w:r>
-        <w:t xml:space="preserve"> </w:t>
-      </w:r>
-      <w:proofErr w:type="spellStart"/>
-      <w:r>
-        <w:t>tạo</w:t>
-      </w:r>
-      <w:proofErr w:type="spellEnd"/>
-      <w:r>
-        <w:t xml:space="preserve"> project</w:t>
+        <w:t>F0 – Hạ tầng và khởi tạo project</w:t>
       </w:r>
       <w:bookmarkEnd w:id="0"/>
     </w:p>
@@ -1015,38 +945,9 @@
       </w:pPr>
       <w:bookmarkStart w:id="1" w:name="_Toc241853212"/>
       <w:r>
-        <w:t xml:space="preserve">TODO 0.1 </w:t>
-      </w:r>
-      <w:proofErr w:type="spellStart"/>
-      <w:r>
-        <w:t>Tạo</w:t>
-      </w:r>
-      <w:proofErr w:type="spellEnd"/>
-      <w:r>
-        <w:t xml:space="preserve"> </w:t>
-      </w:r>
-      <w:proofErr w:type="spellStart"/>
-      <w:r>
-        <w:t>thư</w:t>
-      </w:r>
-      <w:proofErr w:type="spellEnd"/>
-      <w:r>
-        <w:t xml:space="preserve"> </w:t>
-      </w:r>
-      <w:proofErr w:type="spellStart"/>
-      <w:r>
-        <w:t>mục</w:t>
-      </w:r>
-      <w:proofErr w:type="spellEnd"/>
-      <w:r>
-        <w:t xml:space="preserve"> </w:t>
-      </w:r>
-      <w:proofErr w:type="spellStart"/>
-      <w:r>
-        <w:t>gốc</w:t>
+        <w:t>TODO 0.1 Tạo thư mục gốc</w:t>
       </w:r>
       <w:bookmarkEnd w:id="1"/>
-      <w:proofErr w:type="spellEnd"/>
     </w:p>
     <w:p>
       <w:pPr>
@@ -1059,131 +960,11 @@
           <w:lang w:val="en-US"/>
         </w:rPr>
       </w:pPr>
-      <w:proofErr w:type="spellStart"/>
       <w:r>
         <w:rPr>
           <w:lang w:val="en-US"/>
         </w:rPr>
-        <w:t>Chụp</w:t>
-      </w:r>
-      <w:proofErr w:type="spellEnd"/>
-      <w:r>
-        <w:rPr>
-          <w:lang w:val="en-US"/>
-        </w:rPr>
-        <w:t xml:space="preserve"> </w:t>
-      </w:r>
-      <w:proofErr w:type="spellStart"/>
-      <w:r>
-        <w:rPr>
-          <w:lang w:val="en-US"/>
-        </w:rPr>
-        <w:t>hình</w:t>
-      </w:r>
-      <w:proofErr w:type="spellEnd"/>
-      <w:r>
-        <w:rPr>
-          <w:lang w:val="en-US"/>
-        </w:rPr>
-        <w:t xml:space="preserve"> </w:t>
-      </w:r>
-      <w:proofErr w:type="spellStart"/>
-      <w:r>
-        <w:rPr>
-          <w:lang w:val="en-US"/>
-        </w:rPr>
-        <w:t>kết</w:t>
-      </w:r>
-      <w:proofErr w:type="spellEnd"/>
-      <w:r>
-        <w:rPr>
-          <w:lang w:val="en-US"/>
-        </w:rPr>
-        <w:t xml:space="preserve"> </w:t>
-      </w:r>
-      <w:proofErr w:type="spellStart"/>
-      <w:r>
-        <w:rPr>
-          <w:lang w:val="en-US"/>
-        </w:rPr>
-        <w:t>quả</w:t>
-      </w:r>
-      <w:proofErr w:type="spellEnd"/>
-      <w:r>
-        <w:rPr>
-          <w:lang w:val="en-US"/>
-        </w:rPr>
-        <w:t xml:space="preserve">: </w:t>
-      </w:r>
-      <w:proofErr w:type="spellStart"/>
-      <w:r>
-        <w:rPr>
-          <w:lang w:val="en-US"/>
-        </w:rPr>
-        <w:t>cấu</w:t>
-      </w:r>
-      <w:proofErr w:type="spellEnd"/>
-      <w:r>
-        <w:rPr>
-          <w:lang w:val="en-US"/>
-        </w:rPr>
-        <w:t xml:space="preserve"> </w:t>
-      </w:r>
-      <w:proofErr w:type="spellStart"/>
-      <w:r>
-        <w:rPr>
-          <w:lang w:val="en-US"/>
-        </w:rPr>
-        <w:t>trúc</w:t>
-      </w:r>
-      <w:proofErr w:type="spellEnd"/>
-      <w:r>
-        <w:rPr>
-          <w:lang w:val="en-US"/>
-        </w:rPr>
-        <w:t xml:space="preserve"> project/ </w:t>
-      </w:r>
-      <w:proofErr w:type="spellStart"/>
-      <w:r>
-        <w:rPr>
-          <w:lang w:val="en-US"/>
-        </w:rPr>
-        <w:t>kết</w:t>
-      </w:r>
-      <w:proofErr w:type="spellEnd"/>
-      <w:r>
-        <w:rPr>
-          <w:lang w:val="en-US"/>
-        </w:rPr>
-        <w:t xml:space="preserve"> </w:t>
-      </w:r>
-      <w:proofErr w:type="spellStart"/>
-      <w:r>
-        <w:rPr>
-          <w:lang w:val="en-US"/>
-        </w:rPr>
-        <w:t>quả</w:t>
-      </w:r>
-      <w:proofErr w:type="spellEnd"/>
-      <w:r>
-        <w:rPr>
-          <w:lang w:val="en-US"/>
-        </w:rPr>
-        <w:t xml:space="preserve"> </w:t>
-      </w:r>
-      <w:proofErr w:type="spellStart"/>
-      <w:r>
-        <w:rPr>
-          <w:lang w:val="en-US"/>
-        </w:rPr>
-        <w:t>chạy</w:t>
-      </w:r>
-      <w:proofErr w:type="spellEnd"/>
-      <w:r>
-        <w:rPr>
-          <w:lang w:val="en-US"/>
-        </w:rPr>
-        <w:t xml:space="preserve"> / output terminal </w:t>
+        <w:t xml:space="preserve">Chụp hình kết quả: cấu trúc project/ kết quả chạy / output terminal </w:t>
       </w:r>
     </w:p>
     <w:p>
@@ -1207,35 +988,7 @@
         <w:rPr>
           <w:lang w:val="en-US"/>
         </w:rPr>
-        <w:t xml:space="preserve">chore(infra): add docker compose for </w:t>
-      </w:r>
-      <w:proofErr w:type="spellStart"/>
-      <w:r>
-        <w:rPr>
-          <w:lang w:val="en-US"/>
-        </w:rPr>
-        <w:t>sql</w:t>
-      </w:r>
-      <w:proofErr w:type="spellEnd"/>
-      <w:r>
-        <w:rPr>
-          <w:lang w:val="en-US"/>
-        </w:rPr>
-        <w:t xml:space="preserve"> server, </w:t>
-      </w:r>
-      <w:proofErr w:type="spellStart"/>
-      <w:r>
-        <w:rPr>
-          <w:lang w:val="en-US"/>
-        </w:rPr>
-        <w:t>mongodb</w:t>
-      </w:r>
-      <w:proofErr w:type="spellEnd"/>
-      <w:r>
-        <w:rPr>
-          <w:lang w:val="en-US"/>
-        </w:rPr>
-        <w:t xml:space="preserve"> and mysql`</w:t>
+        <w:t>chore(infra): add docker compose for sql server, mongodb and mysql`</w:t>
       </w:r>
     </w:p>
     <w:p>
@@ -1250,50 +1003,120 @@
         <w:rPr>
           <w:lang w:val="en-US"/>
         </w:rPr>
-        <w:t xml:space="preserve">(Coi ở </w:t>
+        <w:t>(Coi ở mục 9.4 Bảng commit trong file Assignment1_Guide.md)</w:t>
       </w:r>
-      <w:proofErr w:type="spellStart"/>
+    </w:p>
+    <w:p>
+      <w:pPr>
+        <w:ind w:firstLine="0"/>
+        <w:rPr>
+          <w:lang w:val="en-US"/>
+        </w:rPr>
+      </w:pPr>
       <w:r>
         <w:rPr>
           <w:lang w:val="en-US"/>
         </w:rPr>
-        <w:t>mục</w:t>
+        <w:drawing>
+          <wp:inline distT="0" distB="0" distL="0" distR="0" wp14:anchorId="63D99F9F" wp14:editId="195F5B04">
+            <wp:extent cx="5943600" cy="2933065"/>
+            <wp:effectExtent l="0" t="0" r="0" b="635"/>
+            <wp:docPr id="2" name="Picture 2"/>
+            <wp:cNvGraphicFramePr>
+              <a:graphicFrameLocks xmlns:a="http://schemas.openxmlformats.org/drawingml/2006/main" noChangeAspect="1"/>
+            </wp:cNvGraphicFramePr>
+            <a:graphic xmlns:a="http://schemas.openxmlformats.org/drawingml/2006/main">
+              <a:graphicData uri="http://schemas.openxmlformats.org/drawingml/2006/picture">
+                <pic:pic xmlns:pic="http://schemas.openxmlformats.org/drawingml/2006/picture">
+                  <pic:nvPicPr>
+                    <pic:cNvPr id="1" name=""/>
+                    <pic:cNvPicPr/>
+                  </pic:nvPicPr>
+                  <pic:blipFill>
+                    <a:blip r:embed="rId9"/>
+                    <a:stretch>
+                      <a:fillRect/>
+                    </a:stretch>
+                  </pic:blipFill>
+                  <pic:spPr>
+                    <a:xfrm>
+                      <a:off x="0" y="0"/>
+                      <a:ext cx="5943600" cy="2933065"/>
+                    </a:xfrm>
+                    <a:prstGeom prst="rect">
+                      <a:avLst/>
+                    </a:prstGeom>
+                  </pic:spPr>
+                </pic:pic>
+              </a:graphicData>
+            </a:graphic>
+          </wp:inline>
+        </w:drawing>
       </w:r>
-      <w:proofErr w:type="spellEnd"/>
+    </w:p>
+    <w:p>
+      <w:pPr>
+        <w:ind w:firstLine="0"/>
+        <w:rPr>
+          <w:lang w:val="en-US"/>
+        </w:rPr>
+      </w:pPr>
+    </w:p>
+    <w:p>
+      <w:pPr>
+        <w:ind w:firstLine="0"/>
+        <w:rPr>
+          <w:lang w:val="en-US"/>
+        </w:rPr>
+      </w:pPr>
       <w:r>
         <w:rPr>
           <w:lang w:val="en-US"/>
         </w:rPr>
-        <w:t xml:space="preserve"> 9.4 </w:t>
+        <w:drawing>
+          <wp:inline distT="0" distB="0" distL="0" distR="0" wp14:anchorId="515CC8A1" wp14:editId="22BBAC09">
+            <wp:extent cx="5943600" cy="1855470"/>
+            <wp:effectExtent l="0" t="0" r="0" b="0"/>
+            <wp:docPr id="3" name="Picture 3"/>
+            <wp:cNvGraphicFramePr>
+              <a:graphicFrameLocks xmlns:a="http://schemas.openxmlformats.org/drawingml/2006/main" noChangeAspect="1"/>
+            </wp:cNvGraphicFramePr>
+            <a:graphic xmlns:a="http://schemas.openxmlformats.org/drawingml/2006/main">
+              <a:graphicData uri="http://schemas.openxmlformats.org/drawingml/2006/picture">
+                <pic:pic xmlns:pic="http://schemas.openxmlformats.org/drawingml/2006/picture">
+                  <pic:nvPicPr>
+                    <pic:cNvPr id="1" name=""/>
+                    <pic:cNvPicPr/>
+                  </pic:nvPicPr>
+                  <pic:blipFill>
+                    <a:blip r:embed="rId10"/>
+                    <a:stretch>
+                      <a:fillRect/>
+                    </a:stretch>
+                  </pic:blipFill>
+                  <pic:spPr>
+                    <a:xfrm>
+                      <a:off x="0" y="0"/>
+                      <a:ext cx="5943600" cy="1855470"/>
+                    </a:xfrm>
+                    <a:prstGeom prst="rect">
+                      <a:avLst/>
+                    </a:prstGeom>
+                  </pic:spPr>
+                </pic:pic>
+              </a:graphicData>
+            </a:graphic>
+          </wp:inline>
+        </w:drawing>
       </w:r>
-      <w:proofErr w:type="spellStart"/>
-      <w:r>
+    </w:p>
+    <w:p>
+      <w:pPr>
+        <w:ind w:firstLine="0"/>
         <w:rPr>
           <w:lang w:val="en-US"/>
         </w:rPr>
-        <w:t>Bảng</w:t>
-      </w:r>
-      <w:proofErr w:type="spellEnd"/>
-      <w:r>
-        <w:rPr>
-          <w:lang w:val="en-US"/>
-        </w:rPr>
-        <w:t xml:space="preserve"> commit </w:t>
-      </w:r>
-      <w:proofErr w:type="spellStart"/>
-      <w:r>
-        <w:rPr>
-          <w:lang w:val="en-US"/>
-        </w:rPr>
-        <w:t>trong</w:t>
-      </w:r>
-      <w:proofErr w:type="spellEnd"/>
-      <w:r>
-        <w:rPr>
-          <w:lang w:val="en-US"/>
-        </w:rPr>
-        <w:t xml:space="preserve"> file Assignment1_Guide.md)</w:t>
-      </w:r>
+      </w:pPr>
     </w:p>
     <w:p>
       <w:pPr>
@@ -1309,55 +1132,7 @@
           <w:rFonts w:eastAsiaTheme="majorEastAsia" w:cstheme="majorBidi"/>
           <w:szCs w:val="32"/>
         </w:rPr>
-        <w:t xml:space="preserve">TODO 0.2 </w:t>
-      </w:r>
-      <w:proofErr w:type="spellStart"/>
-      <w:r>
-        <w:rPr>
-          <w:rFonts w:eastAsiaTheme="majorEastAsia" w:cstheme="majorBidi"/>
-          <w:szCs w:val="32"/>
-        </w:rPr>
-        <w:t>mysql</w:t>
-      </w:r>
-      <w:proofErr w:type="spellEnd"/>
-      <w:r>
-        <w:rPr>
-          <w:rFonts w:eastAsiaTheme="majorEastAsia" w:cstheme="majorBidi"/>
-          <w:szCs w:val="32"/>
-        </w:rPr>
-        <w:t>/</w:t>
-      </w:r>
-      <w:proofErr w:type="spellStart"/>
-      <w:r>
-        <w:rPr>
-          <w:rFonts w:eastAsiaTheme="majorEastAsia" w:cstheme="majorBidi"/>
-          <w:szCs w:val="32"/>
-        </w:rPr>
-        <w:t>init.sql</w:t>
-      </w:r>
-      <w:proofErr w:type="spellEnd"/>
-      <w:r>
-        <w:rPr>
-          <w:rFonts w:eastAsiaTheme="majorEastAsia" w:cstheme="majorBidi"/>
-          <w:szCs w:val="32"/>
-        </w:rPr>
-        <w:t> </w:t>
-      </w:r>
-      <w:proofErr w:type="spellStart"/>
-      <w:r>
-        <w:rPr>
-          <w:rFonts w:eastAsiaTheme="majorEastAsia" w:cstheme="majorBidi"/>
-          <w:szCs w:val="32"/>
-        </w:rPr>
-        <w:t>tạo</w:t>
-      </w:r>
-      <w:proofErr w:type="spellEnd"/>
-      <w:r>
-        <w:rPr>
-          <w:rFonts w:eastAsiaTheme="majorEastAsia" w:cstheme="majorBidi"/>
-          <w:szCs w:val="32"/>
-        </w:rPr>
-        <w:t xml:space="preserve"> 3</w:t>
+        <w:t>TODO 0.2 mysql/init.sql tạo 3</w:t>
       </w:r>
       <w:r>
         <w:t xml:space="preserve"> </w:t>
@@ -1381,131 +1156,11 @@
           <w:lang w:val="en-US"/>
         </w:rPr>
       </w:pPr>
-      <w:proofErr w:type="spellStart"/>
       <w:r>
         <w:rPr>
           <w:lang w:val="en-US"/>
         </w:rPr>
-        <w:t>Chụp</w:t>
-      </w:r>
-      <w:proofErr w:type="spellEnd"/>
-      <w:r>
-        <w:rPr>
-          <w:lang w:val="en-US"/>
-        </w:rPr>
-        <w:t xml:space="preserve"> </w:t>
-      </w:r>
-      <w:proofErr w:type="spellStart"/>
-      <w:r>
-        <w:rPr>
-          <w:lang w:val="en-US"/>
-        </w:rPr>
-        <w:t>hình</w:t>
-      </w:r>
-      <w:proofErr w:type="spellEnd"/>
-      <w:r>
-        <w:rPr>
-          <w:lang w:val="en-US"/>
-        </w:rPr>
-        <w:t xml:space="preserve"> </w:t>
-      </w:r>
-      <w:proofErr w:type="spellStart"/>
-      <w:r>
-        <w:rPr>
-          <w:lang w:val="en-US"/>
-        </w:rPr>
-        <w:t>kết</w:t>
-      </w:r>
-      <w:proofErr w:type="spellEnd"/>
-      <w:r>
-        <w:rPr>
-          <w:lang w:val="en-US"/>
-        </w:rPr>
-        <w:t xml:space="preserve"> </w:t>
-      </w:r>
-      <w:proofErr w:type="spellStart"/>
-      <w:r>
-        <w:rPr>
-          <w:lang w:val="en-US"/>
-        </w:rPr>
-        <w:t>quả</w:t>
-      </w:r>
-      <w:proofErr w:type="spellEnd"/>
-      <w:r>
-        <w:rPr>
-          <w:lang w:val="en-US"/>
-        </w:rPr>
-        <w:t xml:space="preserve">: </w:t>
-      </w:r>
-      <w:proofErr w:type="spellStart"/>
-      <w:r>
-        <w:rPr>
-          <w:lang w:val="en-US"/>
-        </w:rPr>
-        <w:t>cấu</w:t>
-      </w:r>
-      <w:proofErr w:type="spellEnd"/>
-      <w:r>
-        <w:rPr>
-          <w:lang w:val="en-US"/>
-        </w:rPr>
-        <w:t xml:space="preserve"> </w:t>
-      </w:r>
-      <w:proofErr w:type="spellStart"/>
-      <w:r>
-        <w:rPr>
-          <w:lang w:val="en-US"/>
-        </w:rPr>
-        <w:t>trúc</w:t>
-      </w:r>
-      <w:proofErr w:type="spellEnd"/>
-      <w:r>
-        <w:rPr>
-          <w:lang w:val="en-US"/>
-        </w:rPr>
-        <w:t xml:space="preserve"> project/ </w:t>
-      </w:r>
-      <w:proofErr w:type="spellStart"/>
-      <w:r>
-        <w:rPr>
-          <w:lang w:val="en-US"/>
-        </w:rPr>
-        <w:t>kết</w:t>
-      </w:r>
-      <w:proofErr w:type="spellEnd"/>
-      <w:r>
-        <w:rPr>
-          <w:lang w:val="en-US"/>
-        </w:rPr>
-        <w:t xml:space="preserve"> </w:t>
-      </w:r>
-      <w:proofErr w:type="spellStart"/>
-      <w:r>
-        <w:rPr>
-          <w:lang w:val="en-US"/>
-        </w:rPr>
-        <w:t>quả</w:t>
-      </w:r>
-      <w:proofErr w:type="spellEnd"/>
-      <w:r>
-        <w:rPr>
-          <w:lang w:val="en-US"/>
-        </w:rPr>
-        <w:t xml:space="preserve"> </w:t>
-      </w:r>
-      <w:proofErr w:type="spellStart"/>
-      <w:r>
-        <w:rPr>
-          <w:lang w:val="en-US"/>
-        </w:rPr>
-        <w:t>chạy</w:t>
-      </w:r>
-      <w:proofErr w:type="spellEnd"/>
-      <w:r>
-        <w:rPr>
-          <w:lang w:val="en-US"/>
-        </w:rPr>
-        <w:t xml:space="preserve"> / output terminal </w:t>
+        <w:t xml:space="preserve">Chụp hình kết quả: cấu trúc project/ kết quả chạy / output terminal </w:t>
       </w:r>
     </w:p>
     <w:p>
@@ -1529,104 +1184,21 @@
         <w:rPr>
           <w:lang w:val="en-US"/>
         </w:rPr>
-        <w:t xml:space="preserve">chore(infra): add docker compose for </w:t>
+        <w:t>chore(infra): add docker compose for sql server, mongodb and mysql`</w:t>
       </w:r>
-      <w:proofErr w:type="spellStart"/>
+    </w:p>
+    <w:p>
+      <w:pPr>
+        <w:rPr>
+          <w:lang w:val="en-US"/>
+        </w:rPr>
+      </w:pPr>
       <w:r>
         <w:rPr>
           <w:lang w:val="en-US"/>
         </w:rPr>
-        <w:t>sql</w:t>
-      </w:r>
-      <w:proofErr w:type="spellEnd"/>
-      <w:r>
-        <w:rPr>
-          <w:lang w:val="en-US"/>
-        </w:rPr>
-        <w:t xml:space="preserve"> server, </w:t>
-      </w:r>
-      <w:proofErr w:type="spellStart"/>
-      <w:r>
-        <w:rPr>
-          <w:lang w:val="en-US"/>
-        </w:rPr>
-        <w:t>mongodb</w:t>
-      </w:r>
-      <w:proofErr w:type="spellEnd"/>
-      <w:r>
-        <w:rPr>
-          <w:lang w:val="en-US"/>
-        </w:rPr>
-        <w:t xml:space="preserve"> and </w:t>
-      </w:r>
-      <w:proofErr w:type="spellStart"/>
-      <w:r>
-        <w:rPr>
-          <w:lang w:val="en-US"/>
-        </w:rPr>
-        <w:t>mysql</w:t>
-      </w:r>
-      <w:proofErr w:type="spellEnd"/>
-      <w:r>
-        <w:rPr>
-          <w:lang w:val="en-US"/>
-        </w:rPr>
-        <w:t>`</w:t>
-      </w:r>
-    </w:p>
-    <w:p>
-      <w:pPr>
-        <w:rPr>
-          <w:lang w:val="en-US"/>
-        </w:rPr>
-      </w:pPr>
-      <w:r>
-        <w:rPr>
-          <w:lang w:val="en-US"/>
-        </w:rPr>
-        <w:t xml:space="preserve">(Coi ở </w:t>
-      </w:r>
-      <w:proofErr w:type="spellStart"/>
-      <w:r>
-        <w:rPr>
-          <w:lang w:val="en-US"/>
-        </w:rPr>
-        <w:t>mục</w:t>
-      </w:r>
-      <w:proofErr w:type="spellEnd"/>
-      <w:r>
-        <w:rPr>
-          <w:lang w:val="en-US"/>
-        </w:rPr>
-        <w:t xml:space="preserve"> 9.4 </w:t>
-      </w:r>
-      <w:proofErr w:type="spellStart"/>
-      <w:r>
-        <w:rPr>
-          <w:lang w:val="en-US"/>
-        </w:rPr>
-        <w:t>Bảng</w:t>
-      </w:r>
-      <w:proofErr w:type="spellEnd"/>
-      <w:r>
-        <w:rPr>
-          <w:lang w:val="en-US"/>
-        </w:rPr>
-        <w:t xml:space="preserve"> commit </w:t>
-      </w:r>
-      <w:proofErr w:type="spellStart"/>
-      <w:r>
-        <w:rPr>
-          <w:lang w:val="en-US"/>
-        </w:rPr>
-        <w:t>trong</w:t>
-      </w:r>
-      <w:proofErr w:type="spellEnd"/>
-      <w:r>
-        <w:rPr>
-          <w:lang w:val="en-US"/>
-        </w:rPr>
-        <w:t xml:space="preserve"> file Assignment1_Guide.md)</w:t>
+        <w:lastRenderedPageBreak/>
+        <w:t>(Coi ở mục 9.4 Bảng commit trong file Assignment1_Guide.md)</w:t>
       </w:r>
     </w:p>
     <w:p>
@@ -1638,6 +1210,106 @@
           <w:lang w:val="en-US"/>
         </w:rPr>
       </w:pPr>
+      <w:r>
+        <w:rPr>
+          <w:lang w:val="en-US"/>
+        </w:rPr>
+        <w:drawing>
+          <wp:inline distT="0" distB="0" distL="0" distR="0" wp14:anchorId="154D290C" wp14:editId="472F85CF">
+            <wp:extent cx="5943600" cy="2947035"/>
+            <wp:effectExtent l="0" t="0" r="0" b="5715"/>
+            <wp:docPr id="1" name="Picture 1"/>
+            <wp:cNvGraphicFramePr>
+              <a:graphicFrameLocks xmlns:a="http://schemas.openxmlformats.org/drawingml/2006/main" noChangeAspect="1"/>
+            </wp:cNvGraphicFramePr>
+            <a:graphic xmlns:a="http://schemas.openxmlformats.org/drawingml/2006/main">
+              <a:graphicData uri="http://schemas.openxmlformats.org/drawingml/2006/picture">
+                <pic:pic xmlns:pic="http://schemas.openxmlformats.org/drawingml/2006/picture">
+                  <pic:nvPicPr>
+                    <pic:cNvPr id="1" name=""/>
+                    <pic:cNvPicPr/>
+                  </pic:nvPicPr>
+                  <pic:blipFill>
+                    <a:blip r:embed="rId11"/>
+                    <a:stretch>
+                      <a:fillRect/>
+                    </a:stretch>
+                  </pic:blipFill>
+                  <pic:spPr>
+                    <a:xfrm>
+                      <a:off x="0" y="0"/>
+                      <a:ext cx="5943600" cy="2947035"/>
+                    </a:xfrm>
+                    <a:prstGeom prst="rect">
+                      <a:avLst/>
+                    </a:prstGeom>
+                  </pic:spPr>
+                </pic:pic>
+              </a:graphicData>
+            </a:graphic>
+          </wp:inline>
+        </w:drawing>
+      </w:r>
+    </w:p>
+    <w:p>
+      <w:pPr>
+        <w:pStyle w:val="ListParagraph"/>
+        <w:ind w:left="792" w:firstLine="0"/>
+        <w:jc w:val="left"/>
+        <w:rPr>
+          <w:lang w:val="en-US"/>
+        </w:rPr>
+      </w:pPr>
+    </w:p>
+    <w:p>
+      <w:pPr>
+        <w:pStyle w:val="ListParagraph"/>
+        <w:ind w:left="792" w:firstLine="0"/>
+        <w:jc w:val="left"/>
+        <w:rPr>
+          <w:lang w:val="en-US"/>
+        </w:rPr>
+      </w:pPr>
+      <w:r>
+        <w:rPr>
+          <w:lang w:val="en-US"/>
+        </w:rPr>
+        <w:drawing>
+          <wp:inline distT="0" distB="0" distL="0" distR="0" wp14:anchorId="18004E53" wp14:editId="2E106094">
+            <wp:extent cx="5943600" cy="911225"/>
+            <wp:effectExtent l="0" t="0" r="0" b="3175"/>
+            <wp:docPr id="4" name="Picture 4"/>
+            <wp:cNvGraphicFramePr>
+              <a:graphicFrameLocks xmlns:a="http://schemas.openxmlformats.org/drawingml/2006/main" noChangeAspect="1"/>
+            </wp:cNvGraphicFramePr>
+            <a:graphic xmlns:a="http://schemas.openxmlformats.org/drawingml/2006/main">
+              <a:graphicData uri="http://schemas.openxmlformats.org/drawingml/2006/picture">
+                <pic:pic xmlns:pic="http://schemas.openxmlformats.org/drawingml/2006/picture">
+                  <pic:nvPicPr>
+                    <pic:cNvPr id="1" name=""/>
+                    <pic:cNvPicPr/>
+                  </pic:nvPicPr>
+                  <pic:blipFill>
+                    <a:blip r:embed="rId12"/>
+                    <a:stretch>
+                      <a:fillRect/>
+                    </a:stretch>
+                  </pic:blipFill>
+                  <pic:spPr>
+                    <a:xfrm>
+                      <a:off x="0" y="0"/>
+                      <a:ext cx="5943600" cy="911225"/>
+                    </a:xfrm>
+                    <a:prstGeom prst="rect">
+                      <a:avLst/>
+                    </a:prstGeom>
+                  </pic:spPr>
+                </pic:pic>
+              </a:graphicData>
+            </a:graphic>
+          </wp:inline>
+        </w:drawing>
+      </w:r>
     </w:p>
     <w:p>
       <w:pPr>
@@ -1656,6 +1328,99 @@
     <w:p>
       <w:pPr>
         <w:pStyle w:val="Heading2"/>
+        <w:ind w:left="792"/>
+      </w:pPr>
+    </w:p>
+    <w:p>
+      <w:pPr>
+        <w:pStyle w:val="Heading2"/>
+        <w:ind w:left="792"/>
+      </w:pPr>
+      <w:r>
+        <w:drawing>
+          <wp:inline distT="0" distB="0" distL="0" distR="0" wp14:anchorId="7216C42A" wp14:editId="39933FB8">
+            <wp:extent cx="5943600" cy="2965450"/>
+            <wp:effectExtent l="0" t="0" r="0" b="6350"/>
+            <wp:docPr id="5" name="Picture 5"/>
+            <wp:cNvGraphicFramePr>
+              <a:graphicFrameLocks xmlns:a="http://schemas.openxmlformats.org/drawingml/2006/main" noChangeAspect="1"/>
+            </wp:cNvGraphicFramePr>
+            <a:graphic xmlns:a="http://schemas.openxmlformats.org/drawingml/2006/main">
+              <a:graphicData uri="http://schemas.openxmlformats.org/drawingml/2006/picture">
+                <pic:pic xmlns:pic="http://schemas.openxmlformats.org/drawingml/2006/picture">
+                  <pic:nvPicPr>
+                    <pic:cNvPr id="1" name=""/>
+                    <pic:cNvPicPr/>
+                  </pic:nvPicPr>
+                  <pic:blipFill>
+                    <a:blip r:embed="rId13"/>
+                    <a:stretch>
+                      <a:fillRect/>
+                    </a:stretch>
+                  </pic:blipFill>
+                  <pic:spPr>
+                    <a:xfrm>
+                      <a:off x="0" y="0"/>
+                      <a:ext cx="5943600" cy="2965450"/>
+                    </a:xfrm>
+                    <a:prstGeom prst="rect">
+                      <a:avLst/>
+                    </a:prstGeom>
+                  </pic:spPr>
+                </pic:pic>
+              </a:graphicData>
+            </a:graphic>
+          </wp:inline>
+        </w:drawing>
+      </w:r>
+    </w:p>
+    <w:p>
+      <w:pPr>
+        <w:pStyle w:val="Heading2"/>
+        <w:ind w:left="792"/>
+      </w:pPr>
+      <w:r>
+        <w:lastRenderedPageBreak/>
+        <w:drawing>
+          <wp:inline distT="0" distB="0" distL="0" distR="0" wp14:anchorId="6ED53EDB" wp14:editId="3ECC8A02">
+            <wp:extent cx="5943600" cy="2663190"/>
+            <wp:effectExtent l="0" t="0" r="0" b="3810"/>
+            <wp:docPr id="6" name="Picture 6"/>
+            <wp:cNvGraphicFramePr>
+              <a:graphicFrameLocks xmlns:a="http://schemas.openxmlformats.org/drawingml/2006/main" noChangeAspect="1"/>
+            </wp:cNvGraphicFramePr>
+            <a:graphic xmlns:a="http://schemas.openxmlformats.org/drawingml/2006/main">
+              <a:graphicData uri="http://schemas.openxmlformats.org/drawingml/2006/picture">
+                <pic:pic xmlns:pic="http://schemas.openxmlformats.org/drawingml/2006/picture">
+                  <pic:nvPicPr>
+                    <pic:cNvPr id="1" name=""/>
+                    <pic:cNvPicPr/>
+                  </pic:nvPicPr>
+                  <pic:blipFill>
+                    <a:blip r:embed="rId14"/>
+                    <a:stretch>
+                      <a:fillRect/>
+                    </a:stretch>
+                  </pic:blipFill>
+                  <pic:spPr>
+                    <a:xfrm>
+                      <a:off x="0" y="0"/>
+                      <a:ext cx="5943600" cy="2663190"/>
+                    </a:xfrm>
+                    <a:prstGeom prst="rect">
+                      <a:avLst/>
+                    </a:prstGeom>
+                  </pic:spPr>
+                </pic:pic>
+              </a:graphicData>
+            </a:graphic>
+          </wp:inline>
+        </w:drawing>
+      </w:r>
+    </w:p>
+    <w:p>
+      <w:pPr>
+        <w:pStyle w:val="Heading2"/>
         <w:numPr>
           <w:ilvl w:val="1"/>
           <w:numId w:val="32"/>
@@ -1671,81 +1436,158 @@
       <w:pPr>
         <w:pStyle w:val="0NoiDung"/>
       </w:pPr>
-      <w:proofErr w:type="gramStart"/>
       <w:r>
-        <w:t>…..</w:t>
-      </w:r>
-      <w:proofErr w:type="gramEnd"/>
-      <w:r>
-        <w:br/>
-      </w:r>
-      <w:proofErr w:type="spellStart"/>
-      <w:r>
-        <w:t>Mỗi</w:t>
-      </w:r>
-      <w:proofErr w:type="spellEnd"/>
-      <w:r>
-        <w:t xml:space="preserve"> </w:t>
-      </w:r>
-      <w:proofErr w:type="spellStart"/>
-      <w:r>
-        <w:t>mục</w:t>
-      </w:r>
-      <w:proofErr w:type="spellEnd"/>
-      <w:r>
-        <w:t xml:space="preserve"> </w:t>
-      </w:r>
-      <w:proofErr w:type="spellStart"/>
-      <w:r>
-        <w:t>sẽ</w:t>
-      </w:r>
-      <w:proofErr w:type="spellEnd"/>
-      <w:r>
-        <w:t xml:space="preserve"> </w:t>
-      </w:r>
-      <w:proofErr w:type="spellStart"/>
-      <w:r>
-        <w:t>gồm</w:t>
-      </w:r>
-      <w:proofErr w:type="spellEnd"/>
-      <w:r>
-        <w:t xml:space="preserve"> </w:t>
-      </w:r>
-      <w:proofErr w:type="spellStart"/>
-      <w:r>
-        <w:t>kết</w:t>
-      </w:r>
-      <w:proofErr w:type="spellEnd"/>
-      <w:r>
-        <w:t xml:space="preserve"> </w:t>
-      </w:r>
-      <w:proofErr w:type="spellStart"/>
-      <w:r>
-        <w:t>quả</w:t>
-      </w:r>
-      <w:proofErr w:type="spellEnd"/>
-      <w:r>
-        <w:t xml:space="preserve"> </w:t>
-      </w:r>
-      <w:proofErr w:type="spellStart"/>
-      <w:r>
-        <w:t>chạy</w:t>
-      </w:r>
-      <w:proofErr w:type="spellEnd"/>
-      <w:r>
-        <w:t>, commit message</w:t>
+        <w:drawing>
+          <wp:inline distT="0" distB="0" distL="0" distR="0" wp14:anchorId="29EFD9C0" wp14:editId="3BC47A65">
+            <wp:extent cx="5943600" cy="2933065"/>
+            <wp:effectExtent l="0" t="0" r="0" b="635"/>
+            <wp:docPr id="7" name="Picture 7"/>
+            <wp:cNvGraphicFramePr>
+              <a:graphicFrameLocks xmlns:a="http://schemas.openxmlformats.org/drawingml/2006/main" noChangeAspect="1"/>
+            </wp:cNvGraphicFramePr>
+            <a:graphic xmlns:a="http://schemas.openxmlformats.org/drawingml/2006/main">
+              <a:graphicData uri="http://schemas.openxmlformats.org/drawingml/2006/picture">
+                <pic:pic xmlns:pic="http://schemas.openxmlformats.org/drawingml/2006/picture">
+                  <pic:nvPicPr>
+                    <pic:cNvPr id="1" name=""/>
+                    <pic:cNvPicPr/>
+                  </pic:nvPicPr>
+                  <pic:blipFill>
+                    <a:blip r:embed="rId15"/>
+                    <a:stretch>
+                      <a:fillRect/>
+                    </a:stretch>
+                  </pic:blipFill>
+                  <pic:spPr>
+                    <a:xfrm>
+                      <a:off x="0" y="0"/>
+                      <a:ext cx="5943600" cy="2933065"/>
+                    </a:xfrm>
+                    <a:prstGeom prst="rect">
+                      <a:avLst/>
+                    </a:prstGeom>
+                  </pic:spPr>
+                </pic:pic>
+              </a:graphicData>
+            </a:graphic>
+          </wp:inline>
+        </w:drawing>
       </w:r>
     </w:p>
     <w:p>
       <w:pPr>
+        <w:pStyle w:val="0NoiDung"/>
+      </w:pPr>
+    </w:p>
+    <w:p>
+      <w:pPr>
+        <w:pStyle w:val="Heading2"/>
+        <w:numPr>
+          <w:ilvl w:val="1"/>
+          <w:numId w:val="32"/>
+        </w:numPr>
+      </w:pPr>
+      <w:r>
+        <w:t>TODO 0.5</w:t>
+      </w:r>
+    </w:p>
+    <w:p>
+      <w:pPr>
+        <w:pStyle w:val="Heading2"/>
+        <w:ind w:left="792"/>
+      </w:pPr>
+    </w:p>
+    <w:p>
+      <w:pPr>
+        <w:pStyle w:val="Heading2"/>
+        <w:numPr>
+          <w:ilvl w:val="1"/>
+          <w:numId w:val="32"/>
+        </w:numPr>
+      </w:pPr>
+      <w:r>
+        <w:t>TODO 0.6</w:t>
+      </w:r>
+      <w:bookmarkStart w:id="5" w:name="_GoBack"/>
+      <w:bookmarkEnd w:id="5"/>
+    </w:p>
+    <w:p>
+      <w:pPr>
+        <w:pStyle w:val="Heading2"/>
+        <w:numPr>
+          <w:ilvl w:val="1"/>
+          <w:numId w:val="32"/>
+        </w:numPr>
+      </w:pPr>
+      <w:r>
+        <w:t>TODO 1.</w:t>
+      </w:r>
+      <w:r>
+        <w:t>1</w:t>
+      </w:r>
+    </w:p>
+    <w:p>
+      <w:pPr>
+        <w:pStyle w:val="Heading2"/>
+        <w:numPr>
+          <w:ilvl w:val="1"/>
+          <w:numId w:val="32"/>
+        </w:numPr>
+      </w:pPr>
+      <w:r>
+        <w:t>TODO 1.2</w:t>
+      </w:r>
+    </w:p>
+    <w:p>
+      <w:pPr>
+        <w:pStyle w:val="Heading2"/>
+        <w:numPr>
+          <w:ilvl w:val="1"/>
+          <w:numId w:val="32"/>
+        </w:numPr>
+      </w:pPr>
+      <w:r>
+        <w:t>TODO 1.3</w:t>
+      </w:r>
+    </w:p>
+    <w:p>
+      <w:pPr>
+        <w:pStyle w:val="Heading2"/>
+        <w:ind w:left="360"/>
+      </w:pPr>
+    </w:p>
+    <w:p>
+      <w:pPr>
+        <w:pStyle w:val="Heading2"/>
+        <w:ind w:left="792"/>
+      </w:pPr>
+    </w:p>
+    <w:p>
+      <w:pPr>
+        <w:pStyle w:val="Heading2"/>
+        <w:ind w:left="360"/>
+      </w:pPr>
+    </w:p>
+    <w:p>
+      <w:pPr>
+        <w:pStyle w:val="0NoiDung"/>
+      </w:pPr>
+      <w:r>
+        <w:br/>
+        <w:t>Mỗi mục sẽ gồm kết quả chạy, commit message</w:t>
+      </w:r>
+    </w:p>
+    <w:p>
+      <w:pPr>
         <w:pStyle w:val="Heading1"/>
         <w:numPr>
           <w:ilvl w:val="0"/>
-          <w:numId w:val="32"/>
+          <w:numId w:val="37"/>
         </w:numPr>
       </w:pPr>
-      <w:bookmarkStart w:id="5" w:name="_Toc241853216"/>
+      <w:bookmarkStart w:id="6" w:name="_Toc241853216"/>
       <w:r>
+        <w:lastRenderedPageBreak/>
         <w:t xml:space="preserve">F1- </w:t>
       </w:r>
       <w:r>
@@ -1754,110 +1596,49 @@
         </w:rPr>
         <w:t>Authentication (customer-service + Gateway)</w:t>
       </w:r>
-      <w:bookmarkEnd w:id="5"/>
+      <w:bookmarkEnd w:id="6"/>
     </w:p>
     <w:p>
       <w:pPr>
         <w:pStyle w:val="Heading1"/>
         <w:numPr>
           <w:ilvl w:val="1"/>
-          <w:numId w:val="32"/>
+          <w:numId w:val="37"/>
         </w:numPr>
       </w:pPr>
-      <w:bookmarkStart w:id="6" w:name="_Toc241853217"/>
+      <w:bookmarkStart w:id="7" w:name="_Toc241853217"/>
       <w:r>
         <w:t xml:space="preserve">TODO 2.1 </w:t>
       </w:r>
       <w:r>
-        <w:t>Flyway V1__init.sql (</w:t>
-      </w:r>
-      <w:proofErr w:type="spellStart"/>
-      <w:r>
-        <w:t>bảng</w:t>
-      </w:r>
-      <w:proofErr w:type="spellEnd"/>
-      <w:r>
-        <w:t xml:space="preserve"> customer) + V2__seed.sql (3 customer </w:t>
-      </w:r>
-      <w:proofErr w:type="spellStart"/>
-      <w:r>
-        <w:t>mẫu</w:t>
-      </w:r>
-      <w:proofErr w:type="spellEnd"/>
-      <w:r>
-        <w:t>, 1 INACTIVE)</w:t>
-      </w:r>
-      <w:bookmarkEnd w:id="6"/>
-    </w:p>
-    <w:p>
-      <w:pPr>
-        <w:pStyle w:val="Heading1"/>
-        <w:numPr>
-          <w:ilvl w:val="1"/>
-          <w:numId w:val="32"/>
-        </w:numPr>
-      </w:pPr>
-      <w:bookmarkStart w:id="7" w:name="_Toc241853218"/>
-      <w:proofErr w:type="spellStart"/>
-      <w:r>
-        <w:t>Tiếp</w:t>
-      </w:r>
-      <w:proofErr w:type="spellEnd"/>
-      <w:r>
-        <w:t xml:space="preserve"> </w:t>
-      </w:r>
-      <w:proofErr w:type="spellStart"/>
-      <w:r>
-        <w:t>tục</w:t>
-      </w:r>
-      <w:proofErr w:type="spellEnd"/>
-      <w:r>
-        <w:t xml:space="preserve"> </w:t>
-      </w:r>
-      <w:proofErr w:type="spellStart"/>
-      <w:r>
-        <w:t>các</w:t>
-      </w:r>
-      <w:proofErr w:type="spellEnd"/>
-      <w:r>
-        <w:t xml:space="preserve"> </w:t>
-      </w:r>
-      <w:proofErr w:type="spellStart"/>
-      <w:r>
-        <w:t>phần</w:t>
-      </w:r>
-      <w:proofErr w:type="spellEnd"/>
-      <w:r>
-        <w:t xml:space="preserve"> F11 – </w:t>
-      </w:r>
-      <w:proofErr w:type="spellStart"/>
-      <w:r>
-        <w:t>Kiểm</w:t>
-      </w:r>
-      <w:proofErr w:type="spellEnd"/>
-      <w:r>
-        <w:t xml:space="preserve"> </w:t>
-      </w:r>
-      <w:proofErr w:type="spellStart"/>
-      <w:r>
-        <w:t>thử</w:t>
-      </w:r>
-      <w:proofErr w:type="spellEnd"/>
-      <w:r>
-        <w:t xml:space="preserve"> Postman.</w:t>
+        <w:t>Flyway V1__init.sql (bảng customer) + V2__seed.sql (3 customer mẫu, 1 INACTIVE)</w:t>
       </w:r>
       <w:bookmarkEnd w:id="7"/>
     </w:p>
     <w:p>
       <w:pPr>
+        <w:pStyle w:val="Heading1"/>
+        <w:numPr>
+          <w:ilvl w:val="1"/>
+          <w:numId w:val="37"/>
+        </w:numPr>
+      </w:pPr>
+      <w:bookmarkStart w:id="8" w:name="_Toc241853218"/>
+      <w:r>
+        <w:t>Tiếp tục các phần F11 – Kiểm thử Postman.</w:t>
+      </w:r>
+      <w:bookmarkEnd w:id="8"/>
+    </w:p>
+    <w:p>
+      <w:pPr>
         <w:rPr>
           <w:lang w:val="en-US"/>
         </w:rPr>
       </w:pPr>
     </w:p>
     <w:sectPr>
-      <w:headerReference w:type="default" r:id="rId9"/>
-      <w:footerReference w:type="default" r:id="rId10"/>
+      <w:headerReference w:type="default" r:id="rId16"/>
+      <w:footerReference w:type="default" r:id="rId17"/>
       <w:pgSz w:w="12240" w:h="15840"/>
       <w:pgMar w:top="1440" w:right="1440" w:bottom="1440" w:left="1440" w:header="720" w:footer="720" w:gutter="0"/>
       <w:cols w:space="720"/>
@@ -1868,7 +1649,7 @@
 </file>
 
 <file path=word/endnotes.xml><?xml version="1.0" encoding="utf-8"?>
-<w:endnotes xmlns:wpc="http://schemas.microsoft.com/office/word/2010/wordprocessingCanvas" xmlns:cx="http://schemas.microsoft.com/office/drawing/2014/chartex" xmlns:cx1="http://schemas.microsoft.com/office/drawing/2015/9/8/chartex" xmlns:cx2="http://schemas.microsoft.com/office/drawing/2015/10/21/chartex" xmlns:cx3="http://schemas.microsoft.com/office/drawing/2016/5/9/chartex" xmlns:cx4="http://schemas.microsoft.com/office/drawing/2016/5/10/chartex" xmlns:cx5="http://schemas.microsoft.com/office/drawing/2016/5/11/chartex" xmlns:cx6="http://schemas.microsoft.com/office/drawing/2016/5/12/chartex" xmlns:cx7="http://schemas.microsoft.com/office/drawing/2016/5/13/chartex" xmlns:cx8="http://schemas.microsoft.com/office/drawing/2016/5/14/chartex" xmlns:mc="http://schemas.openxmlformats.org/markup-compatibility/2006" xmlns:aink="http://schemas.microsoft.com/office/drawing/2016/ink" xmlns:am3d="http://schemas.microsoft.com/office/drawing/2017/model3d" xmlns:o="urn:schemas-microsoft-com:office:office" xmlns:oel="http://schemas.microsoft.com/office/2019/extlst" xmlns:r="http://schemas.openxmlformats.org/officeDocument/2006/relationships" xmlns:m="http://schemas.openxmlformats.org/officeDocument/2006/math" xmlns:v="urn:schemas-microsoft-com:vml" xmlns:wp14="http://schemas.microsoft.com/office/word/2010/wordprocessingDrawing" xmlns:wp="http://schemas.openxmlformats.org/drawingml/2006/wordprocessingDrawing" xmlns:w10="urn:schemas-microsoft-com:office:word" xmlns:w="http://schemas.openxmlformats.org/wordprocessingml/2006/main" xmlns:w14="http://schemas.microsoft.com/office/word/2010/wordml" xmlns:w15="http://schemas.microsoft.com/office/word/2012/wordml" xmlns:w16cex="http://schemas.microsoft.com/office/word/2018/wordml/cex" xmlns:w16cid="http://schemas.microsoft.com/office/word/2016/wordml/cid" xmlns:w16="http://schemas.microsoft.com/office/word/2018/wordml" xmlns:w16du="http://schemas.microsoft.com/office/word/2023/wordml/word16du" xmlns:w16sdtdh="http://schemas.microsoft.com/office/word/2020/wordml/sdtdatahash" xmlns:w16sdtfl="http://schemas.microsoft.com/office/word/2024/wordml/sdtformatlock" xmlns:w16se="http://schemas.microsoft.com/office/word/2015/wordml/symex" xmlns:wpg="http://schemas.microsoft.com/office/word/2010/wordprocessingGroup" xmlns:wpi="http://schemas.microsoft.com/office/word/2010/wordprocessingInk" xmlns:wne="http://schemas.microsoft.com/office/word/2006/wordml" xmlns:wps="http://schemas.microsoft.com/office/word/2010/wordprocessingShape" mc:Ignorable="w14 w15 w16se w16cid w16 w16cex w16sdtdh w16sdtfl w16du wp14">
+<w:endnotes xmlns:wpc="http://schemas.microsoft.com/office/word/2010/wordprocessingCanvas" xmlns:mc="http://schemas.openxmlformats.org/markup-compatibility/2006" xmlns:o="urn:schemas-microsoft-com:office:office" xmlns:r="http://schemas.openxmlformats.org/officeDocument/2006/relationships" xmlns:m="http://schemas.openxmlformats.org/officeDocument/2006/math" xmlns:v="urn:schemas-microsoft-com:vml" xmlns:wp14="http://schemas.microsoft.com/office/word/2010/wordprocessingDrawing" xmlns:wp="http://schemas.openxmlformats.org/drawingml/2006/wordprocessingDrawing" xmlns:w10="urn:schemas-microsoft-com:office:word" xmlns:w="http://schemas.openxmlformats.org/wordprocessingml/2006/main" xmlns:w14="http://schemas.microsoft.com/office/word/2010/wordml" xmlns:w15="http://schemas.microsoft.com/office/word/2012/wordml" xmlns:wpg="http://schemas.microsoft.com/office/word/2010/wordprocessingGroup" xmlns:wpi="http://schemas.microsoft.com/office/word/2010/wordprocessingInk" xmlns:wne="http://schemas.microsoft.com/office/word/2006/wordml" xmlns:wps="http://schemas.microsoft.com/office/word/2010/wordprocessingShape" mc:Ignorable="w14 w15 wp14">
   <w:endnote w:type="separator" w:id="-1">
     <w:p>
       <w:pPr>
@@ -1893,7 +1674,7 @@
 </file>
 
 <file path=word/footer1.xml><?xml version="1.0" encoding="utf-8"?>
-<w:ftr xmlns:wpc="http://schemas.microsoft.com/office/word/2010/wordprocessingCanvas" xmlns:cx="http://schemas.microsoft.com/office/drawing/2014/chartex" xmlns:cx1="http://schemas.microsoft.com/office/drawing/2015/9/8/chartex" xmlns:cx2="http://schemas.microsoft.com/office/drawing/2015/10/21/chartex" xmlns:cx3="http://schemas.microsoft.com/office/drawing/2016/5/9/chartex" xmlns:cx4="http://schemas.microsoft.com/office/drawing/2016/5/10/chartex" xmlns:cx5="http://schemas.microsoft.com/office/drawing/2016/5/11/chartex" xmlns:cx6="http://schemas.microsoft.com/office/drawing/2016/5/12/chartex" xmlns:cx7="http://schemas.microsoft.com/office/drawing/2016/5/13/chartex" xmlns:cx8="http://schemas.microsoft.com/office/drawing/2016/5/14/chartex" xmlns:mc="http://schemas.openxmlformats.org/markup-compatibility/2006" xmlns:aink="http://schemas.microsoft.com/office/drawing/2016/ink" xmlns:am3d="http://schemas.microsoft.com/office/drawing/2017/model3d" xmlns:o="urn:schemas-microsoft-com:office:office" xmlns:oel="http://schemas.microsoft.com/office/2019/extlst" xmlns:r="http://schemas.openxmlformats.org/officeDocument/2006/relationships" xmlns:m="http://schemas.openxmlformats.org/officeDocument/2006/math" xmlns:v="urn:schemas-microsoft-com:vml" xmlns:wp14="http://schemas.microsoft.com/office/word/2010/wordprocessingDrawing" xmlns:wp="http://schemas.openxmlformats.org/drawingml/2006/wordprocessingDrawing" xmlns:w10="urn:schemas-microsoft-com:office:word" xmlns:w="http://schemas.openxmlformats.org/wordprocessingml/2006/main" xmlns:w14="http://schemas.microsoft.com/office/word/2010/wordml" xmlns:w15="http://schemas.microsoft.com/office/word/2012/wordml" xmlns:w16cex="http://schemas.microsoft.com/office/word/2018/wordml/cex" xmlns:w16cid="http://schemas.microsoft.com/office/word/2016/wordml/cid" xmlns:w16="http://schemas.microsoft.com/office/word/2018/wordml" xmlns:w16du="http://schemas.microsoft.com/office/word/2023/wordml/word16du" xmlns:w16sdtdh="http://schemas.microsoft.com/office/word/2020/wordml/sdtdatahash" xmlns:w16sdtfl="http://schemas.microsoft.com/office/word/2024/wordml/sdtformatlock" xmlns:w16se="http://schemas.microsoft.com/office/word/2015/wordml/symex" xmlns:wpg="http://schemas.microsoft.com/office/word/2010/wordprocessingGroup" xmlns:wpi="http://schemas.microsoft.com/office/word/2010/wordprocessingInk" xmlns:wne="http://schemas.microsoft.com/office/word/2006/wordml" xmlns:wps="http://schemas.microsoft.com/office/word/2010/wordprocessingShape" mc:Ignorable="w14 w15 w16se w16cid w16 w16cex w16sdtdh w16sdtfl w16du wp14">
+<w:ftr xmlns:wpc="http://schemas.microsoft.com/office/word/2010/wordprocessingCanvas" xmlns:mc="http://schemas.openxmlformats.org/markup-compatibility/2006" xmlns:o="urn:schemas-microsoft-com:office:office" xmlns:r="http://schemas.openxmlformats.org/officeDocument/2006/relationships" xmlns:m="http://schemas.openxmlformats.org/officeDocument/2006/math" xmlns:v="urn:schemas-microsoft-com:vml" xmlns:wp14="http://schemas.microsoft.com/office/word/2010/wordprocessingDrawing" xmlns:wp="http://schemas.openxmlformats.org/drawingml/2006/wordprocessingDrawing" xmlns:w10="urn:schemas-microsoft-com:office:word" xmlns:w="http://schemas.openxmlformats.org/wordprocessingml/2006/main" xmlns:w14="http://schemas.microsoft.com/office/word/2010/wordml" xmlns:w15="http://schemas.microsoft.com/office/word/2012/wordml" xmlns:wpg="http://schemas.microsoft.com/office/word/2010/wordprocessingGroup" xmlns:wpi="http://schemas.microsoft.com/office/word/2010/wordprocessingInk" xmlns:wne="http://schemas.microsoft.com/office/word/2006/wordml" xmlns:wps="http://schemas.microsoft.com/office/word/2010/wordprocessingShape" mc:Ignorable="w14 w15 wp14">
   <w:p>
     <w:pPr>
       <w:pStyle w:val="Footer"/>
@@ -1905,33 +1686,11 @@
         <w:lang w:val="en-US"/>
       </w:rPr>
     </w:pPr>
-    <w:proofErr w:type="spellStart"/>
     <w:r>
       <w:rPr>
         <w:lang w:val="en-US"/>
       </w:rPr>
-      <w:t>Họ</w:t>
-    </w:r>
-    <w:proofErr w:type="spellEnd"/>
-    <w:r>
-      <w:rPr>
-        <w:lang w:val="en-US"/>
-      </w:rPr>
-      <w:t xml:space="preserve"> </w:t>
-    </w:r>
-    <w:proofErr w:type="spellStart"/>
-    <w:r>
-      <w:rPr>
-        <w:lang w:val="en-US"/>
-      </w:rPr>
-      <w:t>tên</w:t>
-    </w:r>
-    <w:proofErr w:type="spellEnd"/>
-    <w:r>
-      <w:rPr>
-        <w:lang w:val="en-US"/>
-      </w:rPr>
-      <w:t xml:space="preserve"> SV:</w:t>
+      <w:t>Họ tên SV:</w:t>
     </w:r>
     <w:r>
       <w:rPr>
@@ -1969,7 +1728,7 @@
         <w:noProof/>
         <w:lang w:val="en-US"/>
       </w:rPr>
-      <w:t>1</w:t>
+      <w:t>6</w:t>
     </w:r>
     <w:r>
       <w:rPr>
@@ -1983,7 +1742,7 @@
 </file>
 
 <file path=word/footnotes.xml><?xml version="1.0" encoding="utf-8"?>
-<w:footnotes xmlns:wpc="http://schemas.microsoft.com/office/word/2010/wordprocessingCanvas" xmlns:cx="http://schemas.microsoft.com/office/drawing/2014/chartex" xmlns:cx1="http://schemas.microsoft.com/office/drawing/2015/9/8/chartex" xmlns:cx2="http://schemas.microsoft.com/office/drawing/2015/10/21/chartex" xmlns:cx3="http://schemas.microsoft.com/office/drawing/2016/5/9/chartex" xmlns:cx4="http://schemas.microsoft.com/office/drawing/2016/5/10/chartex" xmlns:cx5="http://schemas.microsoft.com/office/drawing/2016/5/11/chartex" xmlns:cx6="http://schemas.microsoft.com/office/drawing/2016/5/12/chartex" xmlns:cx7="http://schemas.microsoft.com/office/drawing/2016/5/13/chartex" xmlns:cx8="http://schemas.microsoft.com/office/drawing/2016/5/14/chartex" xmlns:mc="http://schemas.openxmlformats.org/markup-compatibility/2006" xmlns:aink="http://schemas.microsoft.com/office/drawing/2016/ink" xmlns:am3d="http://schemas.microsoft.com/office/drawing/2017/model3d" xmlns:o="urn:schemas-microsoft-com:office:office" xmlns:oel="http://schemas.microsoft.com/office/2019/extlst" xmlns:r="http://schemas.openxmlformats.org/officeDocument/2006/relationships" xmlns:m="http://schemas.openxmlformats.org/officeDocument/2006/math" xmlns:v="urn:schemas-microsoft-com:vml" xmlns:wp14="http://schemas.microsoft.com/office/word/2010/wordprocessingDrawing" xmlns:wp="http://schemas.openxmlformats.org/drawingml/2006/wordprocessingDrawing" xmlns:w10="urn:schemas-microsoft-com:office:word" xmlns:w="http://schemas.openxmlformats.org/wordprocessingml/2006/main" xmlns:w14="http://schemas.microsoft.com/office/word/2010/wordml" xmlns:w15="http://schemas.microsoft.com/office/word/2012/wordml" xmlns:w16cex="http://schemas.microsoft.com/office/word/2018/wordml/cex" xmlns:w16cid="http://schemas.microsoft.com/office/word/2016/wordml/cid" xmlns:w16="http://schemas.microsoft.com/office/word/2018/wordml" xmlns:w16du="http://schemas.microsoft.com/office/word/2023/wordml/word16du" xmlns:w16sdtdh="http://schemas.microsoft.com/office/word/2020/wordml/sdtdatahash" xmlns:w16sdtfl="http://schemas.microsoft.com/office/word/2024/wordml/sdtformatlock" xmlns:w16se="http://schemas.microsoft.com/office/word/2015/wordml/symex" xmlns:wpg="http://schemas.microsoft.com/office/word/2010/wordprocessingGroup" xmlns:wpi="http://schemas.microsoft.com/office/word/2010/wordprocessingInk" xmlns:wne="http://schemas.microsoft.com/office/word/2006/wordml" xmlns:wps="http://schemas.microsoft.com/office/word/2010/wordprocessingShape" mc:Ignorable="w14 w15 w16se w16cid w16 w16cex w16sdtdh w16sdtfl w16du wp14">
+<w:footnotes xmlns:wpc="http://schemas.microsoft.com/office/word/2010/wordprocessingCanvas" xmlns:mc="http://schemas.openxmlformats.org/markup-compatibility/2006" xmlns:o="urn:schemas-microsoft-com:office:office" xmlns:r="http://schemas.openxmlformats.org/officeDocument/2006/relationships" xmlns:m="http://schemas.openxmlformats.org/officeDocument/2006/math" xmlns:v="urn:schemas-microsoft-com:vml" xmlns:wp14="http://schemas.microsoft.com/office/word/2010/wordprocessingDrawing" xmlns:wp="http://schemas.openxmlformats.org/drawingml/2006/wordprocessingDrawing" xmlns:w10="urn:schemas-microsoft-com:office:word" xmlns:w="http://schemas.openxmlformats.org/wordprocessingml/2006/main" xmlns:w14="http://schemas.microsoft.com/office/word/2010/wordml" xmlns:w15="http://schemas.microsoft.com/office/word/2012/wordml" xmlns:wpg="http://schemas.microsoft.com/office/word/2010/wordprocessingGroup" xmlns:wpi="http://schemas.microsoft.com/office/word/2010/wordprocessingInk" xmlns:wne="http://schemas.microsoft.com/office/word/2006/wordml" xmlns:wps="http://schemas.microsoft.com/office/word/2010/wordprocessingShape" mc:Ignorable="w14 w15 wp14">
   <w:footnote w:type="separator" w:id="-1">
     <w:p>
       <w:pPr>
@@ -2008,7 +1767,7 @@
 </file>
 
 <file path=word/header1.xml><?xml version="1.0" encoding="utf-8"?>
-<w:hdr xmlns:wpc="http://schemas.microsoft.com/office/word/2010/wordprocessingCanvas" xmlns:cx="http://schemas.microsoft.com/office/drawing/2014/chartex" xmlns:cx1="http://schemas.microsoft.com/office/drawing/2015/9/8/chartex" xmlns:cx2="http://schemas.microsoft.com/office/drawing/2015/10/21/chartex" xmlns:cx3="http://schemas.microsoft.com/office/drawing/2016/5/9/chartex" xmlns:cx4="http://schemas.microsoft.com/office/drawing/2016/5/10/chartex" xmlns:cx5="http://schemas.microsoft.com/office/drawing/2016/5/11/chartex" xmlns:cx6="http://schemas.microsoft.com/office/drawing/2016/5/12/chartex" xmlns:cx7="http://schemas.microsoft.com/office/drawing/2016/5/13/chartex" xmlns:cx8="http://schemas.microsoft.com/office/drawing/2016/5/14/chartex" xmlns:mc="http://schemas.openxmlformats.org/markup-compatibility/2006" xmlns:aink="http://schemas.microsoft.com/office/drawing/2016/ink" xmlns:am3d="http://schemas.microsoft.com/office/drawing/2017/model3d" xmlns:o="urn:schemas-microsoft-com:office:office" xmlns:oel="http://schemas.microsoft.com/office/2019/extlst" xmlns:r="http://schemas.openxmlformats.org/officeDocument/2006/relationships" xmlns:m="http://schemas.openxmlformats.org/officeDocument/2006/math" xmlns:v="urn:schemas-microsoft-com:vml" xmlns:wp14="http://schemas.microsoft.com/office/word/2010/wordprocessingDrawing" xmlns:wp="http://schemas.openxmlformats.org/drawingml/2006/wordprocessingDrawing" xmlns:w10="urn:schemas-microsoft-com:office:word" xmlns:w="http://schemas.openxmlformats.org/wordprocessingml/2006/main" xmlns:w14="http://schemas.microsoft.com/office/word/2010/wordml" xmlns:w15="http://schemas.microsoft.com/office/word/2012/wordml" xmlns:w16cex="http://schemas.microsoft.com/office/word/2018/wordml/cex" xmlns:w16cid="http://schemas.microsoft.com/office/word/2016/wordml/cid" xmlns:w16="http://schemas.microsoft.com/office/word/2018/wordml" xmlns:w16du="http://schemas.microsoft.com/office/word/2023/wordml/word16du" xmlns:w16sdtdh="http://schemas.microsoft.com/office/word/2020/wordml/sdtdatahash" xmlns:w16sdtfl="http://schemas.microsoft.com/office/word/2024/wordml/sdtformatlock" xmlns:w16se="http://schemas.microsoft.com/office/word/2015/wordml/symex" xmlns:wpg="http://schemas.microsoft.com/office/word/2010/wordprocessingGroup" xmlns:wpi="http://schemas.microsoft.com/office/word/2010/wordprocessingInk" xmlns:wne="http://schemas.microsoft.com/office/word/2006/wordml" xmlns:wps="http://schemas.microsoft.com/office/word/2010/wordprocessingShape" mc:Ignorable="w14 w15 w16se w16cid w16 w16cex w16sdtdh w16sdtfl w16du wp14">
+<w:hdr xmlns:wpc="http://schemas.microsoft.com/office/word/2010/wordprocessingCanvas" xmlns:mc="http://schemas.openxmlformats.org/markup-compatibility/2006" xmlns:o="urn:schemas-microsoft-com:office:office" xmlns:r="http://schemas.openxmlformats.org/officeDocument/2006/relationships" xmlns:m="http://schemas.openxmlformats.org/officeDocument/2006/math" xmlns:v="urn:schemas-microsoft-com:vml" xmlns:wp14="http://schemas.microsoft.com/office/word/2010/wordprocessingDrawing" xmlns:wp="http://schemas.openxmlformats.org/drawingml/2006/wordprocessingDrawing" xmlns:w10="urn:schemas-microsoft-com:office:word" xmlns:w="http://schemas.openxmlformats.org/wordprocessingml/2006/main" xmlns:w14="http://schemas.microsoft.com/office/word/2010/wordml" xmlns:w15="http://schemas.microsoft.com/office/word/2012/wordml" xmlns:wpg="http://schemas.microsoft.com/office/word/2010/wordprocessingGroup" xmlns:wpi="http://schemas.microsoft.com/office/word/2010/wordprocessingInk" xmlns:wne="http://schemas.microsoft.com/office/word/2006/wordml" xmlns:wps="http://schemas.microsoft.com/office/word/2010/wordprocessingShape" mc:Ignorable="w14 w15 wp14">
   <w:p>
     <w:pPr>
       <w:pStyle w:val="Footer"/>
@@ -2024,34 +1783,14 @@
       <w:rPr>
         <w:lang w:val="en-US"/>
       </w:rPr>
-      <w:t xml:space="preserve">Báo </w:t>
-    </w:r>
-    <w:proofErr w:type="spellStart"/>
-    <w:r>
-      <w:rPr>
-        <w:lang w:val="en-US"/>
-      </w:rPr>
-      <w:t>cáo</w:t>
-    </w:r>
-    <w:proofErr w:type="spellEnd"/>
-    <w:r>
-      <w:rPr>
-        <w:lang w:val="en-US"/>
-      </w:rPr>
-      <w:t xml:space="preserve"> Assignment 1</w:t>
-    </w:r>
-    <w:r>
-      <w:rPr>
-        <w:lang w:val="en-US"/>
-      </w:rPr>
-      <w:t xml:space="preserve"> – FA26</w:t>
+      <w:t>Báo cáo Assignment 1 – FA26</w:t>
     </w:r>
   </w:p>
 </w:hdr>
 </file>
 
 <file path=word/numbering.xml><?xml version="1.0" encoding="utf-8"?>
-<w:numbering xmlns:wpc="http://schemas.microsoft.com/office/word/2010/wordprocessingCanvas" xmlns:cx="http://schemas.microsoft.com/office/drawing/2014/chartex" xmlns:cx1="http://schemas.microsoft.com/office/drawing/2015/9/8/chartex" xmlns:cx2="http://schemas.microsoft.com/office/drawing/2015/10/21/chartex" xmlns:cx3="http://schemas.microsoft.com/office/drawing/2016/5/9/chartex" xmlns:cx4="http://schemas.microsoft.com/office/drawing/2016/5/10/chartex" xmlns:cx5="http://schemas.microsoft.com/office/drawing/2016/5/11/chartex" xmlns:cx6="http://schemas.microsoft.com/office/drawing/2016/5/12/chartex" xmlns:cx7="http://schemas.microsoft.com/office/drawing/2016/5/13/chartex" xmlns:cx8="http://schemas.microsoft.com/office/drawing/2016/5/14/chartex" xmlns:mc="http://schemas.openxmlformats.org/markup-compatibility/2006" xmlns:aink="http://schemas.microsoft.com/office/drawing/2016/ink" xmlns:am3d="http://schemas.microsoft.com/office/drawing/2017/model3d" xmlns:o="urn:schemas-microsoft-com:office:office" xmlns:oel="http://schemas.microsoft.com/office/2019/extlst" xmlns:r="http://schemas.openxmlformats.org/officeDocument/2006/relationships" xmlns:m="http://schemas.openxmlformats.org/officeDocument/2006/math" xmlns:v="urn:schemas-microsoft-com:vml" xmlns:wp14="http://schemas.microsoft.com/office/word/2010/wordprocessingDrawing" xmlns:wp="http://schemas.openxmlformats.org/drawingml/2006/wordprocessingDrawing" xmlns:w10="urn:schemas-microsoft-com:office:word" xmlns:w="http://schemas.openxmlformats.org/wordprocessingml/2006/main" xmlns:w14="http://schemas.microsoft.com/office/word/2010/wordml" xmlns:w15="http://schemas.microsoft.com/office/word/2012/wordml" xmlns:w16cex="http://schemas.microsoft.com/office/word/2018/wordml/cex" xmlns:w16cid="http://schemas.microsoft.com/office/word/2016/wordml/cid" xmlns:w16="http://schemas.microsoft.com/office/word/2018/wordml" xmlns:w16du="http://schemas.microsoft.com/office/word/2023/wordml/word16du" xmlns:w16sdtdh="http://schemas.microsoft.com/office/word/2020/wordml/sdtdatahash" xmlns:w16sdtfl="http://schemas.microsoft.com/office/word/2024/wordml/sdtformatlock" xmlns:w16se="http://schemas.microsoft.com/office/word/2015/wordml/symex" xmlns:wpg="http://schemas.microsoft.com/office/word/2010/wordprocessingGroup" xmlns:wpi="http://schemas.microsoft.com/office/word/2010/wordprocessingInk" xmlns:wne="http://schemas.microsoft.com/office/word/2006/wordml" xmlns:wps="http://schemas.microsoft.com/office/word/2010/wordprocessingShape" mc:Ignorable="w14 w15 w16se w16cid w16 w16cex w16sdtdh w16sdtfl w16du wp14">
+<w:numbering xmlns:wpc="http://schemas.microsoft.com/office/word/2010/wordprocessingCanvas" xmlns:mc="http://schemas.openxmlformats.org/markup-compatibility/2006" xmlns:o="urn:schemas-microsoft-com:office:office" xmlns:r="http://schemas.openxmlformats.org/officeDocument/2006/relationships" xmlns:m="http://schemas.openxmlformats.org/officeDocument/2006/math" xmlns:v="urn:schemas-microsoft-com:vml" xmlns:wp14="http://schemas.microsoft.com/office/word/2010/wordprocessingDrawing" xmlns:wp="http://schemas.openxmlformats.org/drawingml/2006/wordprocessingDrawing" xmlns:w10="urn:schemas-microsoft-com:office:word" xmlns:w="http://schemas.openxmlformats.org/wordprocessingml/2006/main" xmlns:w14="http://schemas.microsoft.com/office/word/2010/wordml" xmlns:w15="http://schemas.microsoft.com/office/word/2012/wordml" xmlns:wpg="http://schemas.microsoft.com/office/word/2010/wordprocessingGroup" xmlns:wpi="http://schemas.microsoft.com/office/word/2010/wordprocessingInk" xmlns:wne="http://schemas.microsoft.com/office/word/2006/wordml" xmlns:wps="http://schemas.microsoft.com/office/word/2010/wordprocessingShape" mc:Ignorable="w14 w15 wp14">
   <w:abstractNum w:abstractNumId="0" w15:restartNumberingAfterBreak="0">
     <w:nsid w:val="03300629"/>
     <w:multiLevelType w:val="multilevel"/>
@@ -3787,6 +3526,119 @@
     </w:lvl>
   </w:abstractNum>
   <w:abstractNum w:abstractNumId="17" w15:restartNumberingAfterBreak="0">
+    <w:nsid w:val="617C28B2"/>
+    <w:multiLevelType w:val="multilevel"/>
+    <w:tmpl w:val="C01A1E16"/>
+    <w:lvl w:ilvl="0">
+      <w:start w:val="2"/>
+      <w:numFmt w:val="decimal"/>
+      <w:lvlText w:val="%1.0."/>
+      <w:lvlJc w:val="left"/>
+      <w:pPr>
+        <w:ind w:left="1050" w:hanging="720"/>
+      </w:pPr>
+      <w:rPr>
+        <w:rFonts w:hint="default"/>
+      </w:rPr>
+    </w:lvl>
+    <w:lvl w:ilvl="1">
+      <w:start w:val="1"/>
+      <w:numFmt w:val="decimal"/>
+      <w:lvlText w:val="%1.%2."/>
+      <w:lvlJc w:val="left"/>
+      <w:pPr>
+        <w:ind w:left="1770" w:hanging="720"/>
+      </w:pPr>
+      <w:rPr>
+        <w:rFonts w:hint="default"/>
+      </w:rPr>
+    </w:lvl>
+    <w:lvl w:ilvl="2">
+      <w:start w:val="1"/>
+      <w:numFmt w:val="decimal"/>
+      <w:lvlText w:val="%1.%2.%3."/>
+      <w:lvlJc w:val="left"/>
+      <w:pPr>
+        <w:ind w:left="2490" w:hanging="720"/>
+      </w:pPr>
+      <w:rPr>
+        <w:rFonts w:hint="default"/>
+      </w:rPr>
+    </w:lvl>
+    <w:lvl w:ilvl="3">
+      <w:start w:val="1"/>
+      <w:numFmt w:val="decimal"/>
+      <w:lvlText w:val="%1.%2.%3.%4."/>
+      <w:lvlJc w:val="left"/>
+      <w:pPr>
+        <w:ind w:left="3570" w:hanging="1080"/>
+      </w:pPr>
+      <w:rPr>
+        <w:rFonts w:hint="default"/>
+      </w:rPr>
+    </w:lvl>
+    <w:lvl w:ilvl="4">
+      <w:start w:val="1"/>
+      <w:numFmt w:val="decimal"/>
+      <w:lvlText w:val="%1.%2.%3.%4.%5."/>
+      <w:lvlJc w:val="left"/>
+      <w:pPr>
+        <w:ind w:left="4290" w:hanging="1080"/>
+      </w:pPr>
+      <w:rPr>
+        <w:rFonts w:hint="default"/>
+      </w:rPr>
+    </w:lvl>
+    <w:lvl w:ilvl="5">
+      <w:start w:val="1"/>
+      <w:numFmt w:val="decimal"/>
+      <w:lvlText w:val="%1.%2.%3.%4.%5.%6."/>
+      <w:lvlJc w:val="left"/>
+      <w:pPr>
+        <w:ind w:left="5370" w:hanging="1440"/>
+      </w:pPr>
+      <w:rPr>
+        <w:rFonts w:hint="default"/>
+      </w:rPr>
+    </w:lvl>
+    <w:lvl w:ilvl="6">
+      <w:start w:val="1"/>
+      <w:numFmt w:val="decimal"/>
+      <w:lvlText w:val="%1.%2.%3.%4.%5.%6.%7."/>
+      <w:lvlJc w:val="left"/>
+      <w:pPr>
+        <w:ind w:left="6090" w:hanging="1440"/>
+      </w:pPr>
+      <w:rPr>
+        <w:rFonts w:hint="default"/>
+      </w:rPr>
+    </w:lvl>
+    <w:lvl w:ilvl="7">
+      <w:start w:val="1"/>
+      <w:numFmt w:val="decimal"/>
+      <w:lvlText w:val="%1.%2.%3.%4.%5.%6.%7.%8."/>
+      <w:lvlJc w:val="left"/>
+      <w:pPr>
+        <w:ind w:left="7170" w:hanging="1800"/>
+      </w:pPr>
+      <w:rPr>
+        <w:rFonts w:hint="default"/>
+      </w:rPr>
+    </w:lvl>
+    <w:lvl w:ilvl="8">
+      <w:start w:val="1"/>
+      <w:numFmt w:val="decimal"/>
+      <w:lvlText w:val="%1.%2.%3.%4.%5.%6.%7.%8.%9."/>
+      <w:lvlJc w:val="left"/>
+      <w:pPr>
+        <w:ind w:left="7890" w:hanging="1800"/>
+      </w:pPr>
+      <w:rPr>
+        <w:rFonts w:hint="default"/>
+      </w:rPr>
+    </w:lvl>
+  </w:abstractNum>
+  <w:abstractNum w:abstractNumId="18" w15:restartNumberingAfterBreak="0">
     <w:nsid w:val="670163C4"/>
     <w:multiLevelType w:val="hybridMultilevel"/>
     <w:tmpl w:val="67B4EA98"/>
@@ -3899,7 +3751,7 @@
       </w:rPr>
     </w:lvl>
   </w:abstractNum>
-  <w:abstractNum w:abstractNumId="18" w15:restartNumberingAfterBreak="0">
+  <w:abstractNum w:abstractNumId="19" w15:restartNumberingAfterBreak="0">
     <w:nsid w:val="685D7496"/>
     <w:multiLevelType w:val="hybridMultilevel"/>
     <w:tmpl w:val="D3B42082"/>
@@ -4012,7 +3864,7 @@
       </w:rPr>
     </w:lvl>
   </w:abstractNum>
-  <w:abstractNum w:abstractNumId="19" w15:restartNumberingAfterBreak="0">
+  <w:abstractNum w:abstractNumId="20" w15:restartNumberingAfterBreak="0">
     <w:nsid w:val="6B1609AA"/>
     <w:multiLevelType w:val="multilevel"/>
     <w:tmpl w:val="ED8A7F6C"/>
@@ -4158,7 +4010,7 @@
       </w:rPr>
     </w:lvl>
   </w:abstractNum>
-  <w:abstractNum w:abstractNumId="20" w15:restartNumberingAfterBreak="0">
+  <w:abstractNum w:abstractNumId="21" w15:restartNumberingAfterBreak="0">
     <w:nsid w:val="6ECC4922"/>
     <w:multiLevelType w:val="multilevel"/>
     <w:tmpl w:val="545E1B56"/>
@@ -4281,7 +4133,7 @@
       </w:rPr>
     </w:lvl>
   </w:abstractNum>
-  <w:abstractNum w:abstractNumId="21" w15:restartNumberingAfterBreak="0">
+  <w:abstractNum w:abstractNumId="22" w15:restartNumberingAfterBreak="0">
     <w:nsid w:val="79323C88"/>
     <w:multiLevelType w:val="hybridMultilevel"/>
     <w:tmpl w:val="F62C7F34"/>
@@ -4372,16 +4224,129 @@
       </w:pPr>
     </w:lvl>
   </w:abstractNum>
-  <w:num w:numId="1" w16cid:durableId="626621331">
-    <w:abstractNumId w:val="18"/>
+  <w:abstractNum w:abstractNumId="23" w15:restartNumberingAfterBreak="0">
+    <w:nsid w:val="7CB50E20"/>
+    <w:multiLevelType w:val="multilevel"/>
+    <w:tmpl w:val="4DCCF07C"/>
+    <w:lvl w:ilvl="0">
+      <w:start w:val="2"/>
+      <w:numFmt w:val="decimal"/>
+      <w:lvlText w:val="%1.0"/>
+      <w:lvlJc w:val="left"/>
+      <w:pPr>
+        <w:ind w:left="720" w:hanging="360"/>
+      </w:pPr>
+      <w:rPr>
+        <w:rFonts w:hint="default"/>
+      </w:rPr>
+    </w:lvl>
+    <w:lvl w:ilvl="1">
+      <w:start w:val="1"/>
+      <w:numFmt w:val="decimal"/>
+      <w:lvlText w:val="%1.%2"/>
+      <w:lvlJc w:val="left"/>
+      <w:pPr>
+        <w:ind w:left="1440" w:hanging="360"/>
+      </w:pPr>
+      <w:rPr>
+        <w:rFonts w:hint="default"/>
+      </w:rPr>
+    </w:lvl>
+    <w:lvl w:ilvl="2">
+      <w:start w:val="1"/>
+      <w:numFmt w:val="decimal"/>
+      <w:lvlText w:val="%1.%2.%3"/>
+      <w:lvlJc w:val="left"/>
+      <w:pPr>
+        <w:ind w:left="2520" w:hanging="720"/>
+      </w:pPr>
+      <w:rPr>
+        <w:rFonts w:hint="default"/>
+      </w:rPr>
+    </w:lvl>
+    <w:lvl w:ilvl="3">
+      <w:start w:val="1"/>
+      <w:numFmt w:val="decimal"/>
+      <w:lvlText w:val="%1.%2.%3.%4"/>
+      <w:lvlJc w:val="left"/>
+      <w:pPr>
+        <w:ind w:left="3240" w:hanging="720"/>
+      </w:pPr>
+      <w:rPr>
+        <w:rFonts w:hint="default"/>
+      </w:rPr>
+    </w:lvl>
+    <w:lvl w:ilvl="4">
+      <w:start w:val="1"/>
+      <w:numFmt w:val="decimal"/>
+      <w:lvlText w:val="%1.%2.%3.%4.%5"/>
+      <w:lvlJc w:val="left"/>
+      <w:pPr>
+        <w:ind w:left="4320" w:hanging="1080"/>
+      </w:pPr>
+      <w:rPr>
+        <w:rFonts w:hint="default"/>
+      </w:rPr>
+    </w:lvl>
+    <w:lvl w:ilvl="5">
+      <w:start w:val="1"/>
+      <w:numFmt w:val="decimal"/>
+      <w:lvlText w:val="%1.%2.%3.%4.%5.%6"/>
+      <w:lvlJc w:val="left"/>
+      <w:pPr>
+        <w:ind w:left="5400" w:hanging="1440"/>
+      </w:pPr>
+      <w:rPr>
+        <w:rFonts w:hint="default"/>
+      </w:rPr>
+    </w:lvl>
+    <w:lvl w:ilvl="6">
+      <w:start w:val="1"/>
+      <w:numFmt w:val="decimal"/>
+      <w:lvlText w:val="%1.%2.%3.%4.%5.%6.%7"/>
+      <w:lvlJc w:val="left"/>
+      <w:pPr>
+        <w:ind w:left="6120" w:hanging="1440"/>
+      </w:pPr>
+      <w:rPr>
+        <w:rFonts w:hint="default"/>
+      </w:rPr>
+    </w:lvl>
+    <w:lvl w:ilvl="7">
+      <w:start w:val="1"/>
+      <w:numFmt w:val="decimal"/>
+      <w:lvlText w:val="%1.%2.%3.%4.%5.%6.%7.%8"/>
+      <w:lvlJc w:val="left"/>
+      <w:pPr>
+        <w:ind w:left="7200" w:hanging="1800"/>
+      </w:pPr>
+      <w:rPr>
+        <w:rFonts w:hint="default"/>
+      </w:rPr>
+    </w:lvl>
+    <w:lvl w:ilvl="8">
+      <w:start w:val="1"/>
+      <w:numFmt w:val="decimal"/>
+      <w:lvlText w:val="%1.%2.%3.%4.%5.%6.%7.%8.%9"/>
+      <w:lvlJc w:val="left"/>
+      <w:pPr>
+        <w:ind w:left="7920" w:hanging="1800"/>
+      </w:pPr>
+      <w:rPr>
+        <w:rFonts w:hint="default"/>
+      </w:rPr>
+    </w:lvl>
+  </w:abstractNum>
+  <w:num w:numId="1">
+    <w:abstractNumId w:val="19"/>
   </w:num>
-  <w:num w:numId="2" w16cid:durableId="1939286807">
+  <w:num w:numId="2">
     <w:abstractNumId w:val="4"/>
   </w:num>
-  <w:num w:numId="3" w16cid:durableId="614143463">
+  <w:num w:numId="3">
     <w:abstractNumId w:val="11"/>
   </w:num>
-  <w:num w:numId="4" w16cid:durableId="19360532">
+  <w:num w:numId="4">
     <w:abstractNumId w:val="11"/>
     <w:lvlOverride w:ilvl="0">
       <w:startOverride w:val="1"/>
@@ -4411,104 +4376,110 @@
       <w:startOverride w:val="1"/>
     </w:lvlOverride>
   </w:num>
-  <w:num w:numId="5" w16cid:durableId="378818873">
+  <w:num w:numId="5">
+    <w:abstractNumId w:val="22"/>
+  </w:num>
+  <w:num w:numId="6">
+    <w:abstractNumId w:val="12"/>
+  </w:num>
+  <w:num w:numId="7">
+    <w:abstractNumId w:val="2"/>
+  </w:num>
+  <w:num w:numId="8">
+    <w:abstractNumId w:val="2"/>
+  </w:num>
+  <w:num w:numId="9">
+    <w:abstractNumId w:val="13"/>
+  </w:num>
+  <w:num w:numId="10">
+    <w:abstractNumId w:val="13"/>
+  </w:num>
+  <w:num w:numId="11">
+    <w:abstractNumId w:val="13"/>
+  </w:num>
+  <w:num w:numId="12">
+    <w:abstractNumId w:val="0"/>
+  </w:num>
+  <w:num w:numId="13">
+    <w:abstractNumId w:val="18"/>
+  </w:num>
+  <w:num w:numId="14">
+    <w:abstractNumId w:val="14"/>
+  </w:num>
+  <w:num w:numId="15">
+    <w:abstractNumId w:val="10"/>
+  </w:num>
+  <w:num w:numId="16">
+    <w:abstractNumId w:val="3"/>
+  </w:num>
+  <w:num w:numId="17">
+    <w:abstractNumId w:val="3"/>
+  </w:num>
+  <w:num w:numId="18">
+    <w:abstractNumId w:val="5"/>
+  </w:num>
+  <w:num w:numId="19">
+    <w:abstractNumId w:val="20"/>
+  </w:num>
+  <w:num w:numId="20">
+    <w:abstractNumId w:val="20"/>
+  </w:num>
+  <w:num w:numId="21">
+    <w:abstractNumId w:val="20"/>
+  </w:num>
+  <w:num w:numId="22">
+    <w:abstractNumId w:val="12"/>
+  </w:num>
+  <w:num w:numId="23">
+    <w:abstractNumId w:val="20"/>
+  </w:num>
+  <w:num w:numId="24">
+    <w:abstractNumId w:val="12"/>
+  </w:num>
+  <w:num w:numId="25">
+    <w:abstractNumId w:val="10"/>
+  </w:num>
+  <w:num w:numId="26">
+    <w:abstractNumId w:val="3"/>
+  </w:num>
+  <w:num w:numId="27">
+    <w:abstractNumId w:val="12"/>
+  </w:num>
+  <w:num w:numId="28">
     <w:abstractNumId w:val="21"/>
   </w:num>
-  <w:num w:numId="6" w16cid:durableId="584799792">
-    <w:abstractNumId w:val="12"/>
-  </w:num>
-  <w:num w:numId="7" w16cid:durableId="1505362996">
-    <w:abstractNumId w:val="2"/>
-  </w:num>
-  <w:num w:numId="8" w16cid:durableId="1925602421">
-    <w:abstractNumId w:val="2"/>
-  </w:num>
-  <w:num w:numId="9" w16cid:durableId="1368217948">
-    <w:abstractNumId w:val="13"/>
-  </w:num>
-  <w:num w:numId="10" w16cid:durableId="1649624612">
-    <w:abstractNumId w:val="13"/>
-  </w:num>
-  <w:num w:numId="11" w16cid:durableId="1310866703">
-    <w:abstractNumId w:val="13"/>
-  </w:num>
-  <w:num w:numId="12" w16cid:durableId="827331769">
-    <w:abstractNumId w:val="0"/>
-  </w:num>
-  <w:num w:numId="13" w16cid:durableId="1083255589">
-    <w:abstractNumId w:val="17"/>
-  </w:num>
-  <w:num w:numId="14" w16cid:durableId="23992477">
-    <w:abstractNumId w:val="14"/>
-  </w:num>
-  <w:num w:numId="15" w16cid:durableId="1200433201">
-    <w:abstractNumId w:val="10"/>
-  </w:num>
-  <w:num w:numId="16" w16cid:durableId="1949576472">
-    <w:abstractNumId w:val="3"/>
-  </w:num>
-  <w:num w:numId="17" w16cid:durableId="334695574">
-    <w:abstractNumId w:val="3"/>
-  </w:num>
-  <w:num w:numId="18" w16cid:durableId="257368074">
-    <w:abstractNumId w:val="5"/>
-  </w:num>
-  <w:num w:numId="19" w16cid:durableId="1946378325">
-    <w:abstractNumId w:val="19"/>
-  </w:num>
-  <w:num w:numId="20" w16cid:durableId="1977418466">
-    <w:abstractNumId w:val="19"/>
-  </w:num>
-  <w:num w:numId="21" w16cid:durableId="2063284450">
-    <w:abstractNumId w:val="19"/>
-  </w:num>
-  <w:num w:numId="22" w16cid:durableId="2132551286">
-    <w:abstractNumId w:val="12"/>
-  </w:num>
-  <w:num w:numId="23" w16cid:durableId="1799686690">
-    <w:abstractNumId w:val="19"/>
-  </w:num>
-  <w:num w:numId="24" w16cid:durableId="2097823548">
-    <w:abstractNumId w:val="12"/>
-  </w:num>
-  <w:num w:numId="25" w16cid:durableId="1462503011">
-    <w:abstractNumId w:val="10"/>
-  </w:num>
-  <w:num w:numId="26" w16cid:durableId="589781079">
-    <w:abstractNumId w:val="3"/>
-  </w:num>
-  <w:num w:numId="27" w16cid:durableId="1197235125">
-    <w:abstractNumId w:val="12"/>
-  </w:num>
-  <w:num w:numId="28" w16cid:durableId="1083599824">
-    <w:abstractNumId w:val="20"/>
-  </w:num>
-  <w:num w:numId="29" w16cid:durableId="523253228">
+  <w:num w:numId="29">
     <w:abstractNumId w:val="9"/>
   </w:num>
-  <w:num w:numId="30" w16cid:durableId="1691761248">
+  <w:num w:numId="30">
     <w:abstractNumId w:val="6"/>
   </w:num>
-  <w:num w:numId="31" w16cid:durableId="1343122047">
+  <w:num w:numId="31">
     <w:abstractNumId w:val="15"/>
   </w:num>
-  <w:num w:numId="32" w16cid:durableId="155342907">
+  <w:num w:numId="32">
     <w:abstractNumId w:val="7"/>
   </w:num>
-  <w:num w:numId="33" w16cid:durableId="262343803">
+  <w:num w:numId="33">
     <w:abstractNumId w:val="1"/>
   </w:num>
-  <w:num w:numId="34" w16cid:durableId="919951297">
+  <w:num w:numId="34">
     <w:abstractNumId w:val="16"/>
   </w:num>
-  <w:num w:numId="35" w16cid:durableId="823739193">
+  <w:num w:numId="35">
     <w:abstractNumId w:val="8"/>
+  </w:num>
+  <w:num w:numId="36">
+    <w:abstractNumId w:val="23"/>
+  </w:num>
+  <w:num w:numId="37">
+    <w:abstractNumId w:val="17"/>
   </w:num>
 </w:numbering>
 </file>
 
 <file path=word/styles.xml><?xml version="1.0" encoding="utf-8"?>
-<w:styles xmlns:mc="http://schemas.openxmlformats.org/markup-compatibility/2006" xmlns:r="http://schemas.openxmlformats.org/officeDocument/2006/relationships" xmlns:w="http://schemas.openxmlformats.org/wordprocessingml/2006/main" xmlns:w14="http://schemas.microsoft.com/office/word/2010/wordml" xmlns:w15="http://schemas.microsoft.com/office/word/2012/wordml" xmlns:w16cex="http://schemas.microsoft.com/office/word/2018/wordml/cex" xmlns:w16cid="http://schemas.microsoft.com/office/word/2016/wordml/cid" xmlns:w16="http://schemas.microsoft.com/office/word/2018/wordml" xmlns:w16du="http://schemas.microsoft.com/office/word/2023/wordml/word16du" xmlns:w16sdtdh="http://schemas.microsoft.com/office/word/2020/wordml/sdtdatahash" xmlns:w16sdtfl="http://schemas.microsoft.com/office/word/2024/wordml/sdtformatlock" xmlns:w16se="http://schemas.microsoft.com/office/word/2015/wordml/symex" mc:Ignorable="w14 w15 w16se w16cid w16 w16cex w16sdtdh w16sdtfl w16du">
+<w:styles xmlns:mc="http://schemas.openxmlformats.org/markup-compatibility/2006" xmlns:r="http://schemas.openxmlformats.org/officeDocument/2006/relationships" xmlns:w="http://schemas.openxmlformats.org/wordprocessingml/2006/main" xmlns:w14="http://schemas.microsoft.com/office/word/2010/wordml" xmlns:w15="http://schemas.microsoft.com/office/word/2012/wordml" mc:Ignorable="w14 w15">
   <w:docDefaults>
     <w:rPrDefault>
       <w:rPr>
@@ -4526,7 +4497,7 @@
       </w:pPr>
     </w:pPrDefault>
   </w:docDefaults>
-  <w:latentStyles w:defLockedState="0" w:defUIPriority="99" w:defSemiHidden="0" w:defUnhideWhenUsed="0" w:defQFormat="0" w:count="376">
+  <w:latentStyles w:defLockedState="0" w:defUIPriority="99" w:defSemiHidden="0" w:defUnhideWhenUsed="0" w:defQFormat="0" w:count="371">
     <w:lsdException w:name="Normal" w:uiPriority="0" w:qFormat="1"/>
     <w:lsdException w:name="heading 1" w:uiPriority="9" w:qFormat="1"/>
     <w:lsdException w:name="heading 2" w:semiHidden="1" w:uiPriority="9" w:unhideWhenUsed="1" w:qFormat="1"/>
@@ -4898,11 +4869,6 @@
     <w:lsdException w:name="List Table 5 Dark Accent 6" w:uiPriority="50"/>
     <w:lsdException w:name="List Table 6 Colorful Accent 6" w:uiPriority="51"/>
     <w:lsdException w:name="List Table 7 Colorful Accent 6" w:uiPriority="52"/>
-    <w:lsdException w:name="Mention" w:semiHidden="1" w:unhideWhenUsed="1"/>
-    <w:lsdException w:name="Smart Hyperlink" w:semiHidden="1" w:unhideWhenUsed="1"/>
-    <w:lsdException w:name="Hashtag" w:semiHidden="1" w:unhideWhenUsed="1"/>
-    <w:lsdException w:name="Unresolved Mention" w:semiHidden="1" w:unhideWhenUsed="1"/>
-    <w:lsdException w:name="Smart Link" w:semiHidden="1" w:unhideWhenUsed="1"/>
   </w:latentStyles>
   <w:style w:type="paragraph" w:default="1" w:styleId="Normal">
     <w:name w:val="Normal"/>
@@ -5137,6 +5103,7 @@
   <w:style w:type="character" w:default="1" w:styleId="DefaultParagraphFont">
     <w:name w:val="Default Paragraph Font"/>
     <w:uiPriority w:val="1"/>
+    <w:semiHidden/>
     <w:unhideWhenUsed/>
   </w:style>
   <w:style w:type="table" w:default="1" w:styleId="TableNormal">
@@ -5926,7 +5893,7 @@
       <w:spacing w:val="5"/>
     </w:rPr>
   </w:style>
-  <w:style w:type="character" w:styleId="UnresolvedMention">
+  <w:style w:type="character" w:customStyle="1" w:styleId="UnresolvedMention">
     <w:name w:val="Unresolved Mention"/>
     <w:basedOn w:val="DefaultParagraphFont"/>
     <w:uiPriority w:val="99"/>
@@ -6282,7 +6249,7 @@
 </file>
 
 <file path=customXml/itemProps1.xml><?xml version="1.0" encoding="utf-8"?>
-<ds:datastoreItem xmlns:ds="http://schemas.openxmlformats.org/officeDocument/2006/customXml" ds:itemID="{8A092BE1-D4D7-46CB-95B6-D5087F3661AB}">
+<ds:datastoreItem xmlns:ds="http://schemas.openxmlformats.org/officeDocument/2006/customXml" ds:itemID="{A7B9A171-2C56-4031-857F-647DA22B82D0}">
   <ds:schemaRefs>
     <ds:schemaRef ds:uri="http://schemas.openxmlformats.org/officeDocument/2006/bibliography"/>
   </ds:schemaRefs>

</xml_diff>